<commit_message>
paper: v6 — plain-bold archetype names (no per-archetype colour) + fill page-8 gap
- \arch macro: \textcolor{c#1}{\textbf{#1}} -> \textbf{#1}, so every
  archetype name (prose, cards, tables) renders in bold black instead
  of its brand colour. build_docx.py updated to match (arch expansion
  -> plain bold; docx post-process no longer recolours names).
- Removed the \FloatBarrier between Phase 3 (4.4) and Phase 3.1 (4.5)
  so the Phase 3.1 text and Figs 6-7 flow up to fill the large gap on
  page 8; the full-width Table 3 now floats to the top of page 9.

Note: the figure PNGs (e.g., Fig. 5 trajectories) still encode colour;
those are pre-generated images, untouched here.

Build: pdflatex+bibtex+pdflatex x2 clean; no undefined refs; 12 pages,
no large whitespace gap.
</commit_message>
<xml_diff>
--- a/paper_resources/manuscript/main.docx
+++ b/paper_resources/manuscript/main.docx
@@ -4130,7 +4130,6 @@
         <w:rPr>
           <w:bCs/>
           <w:b/>
-          <w:color w:val="CDD3D8"/>
         </w:rPr>
         <w:t xml:space="preserve">Mirror</w:t>
       </w:r>
@@ -5838,7 +5837,6 @@
         <w:rPr>
           <w:bCs/>
           <w:b/>
-          <w:color w:val="A8B5C3"/>
         </w:rPr>
         <w:t xml:space="preserve">Oracle</w:t>
       </w:r>
@@ -6023,7 +6021,6 @@
         <w:rPr>
           <w:bCs/>
           <w:b/>
-          <w:color w:val="5C8159"/>
         </w:rPr>
         <w:t xml:space="preserve">Sentinel</w:t>
       </w:r>
@@ -6184,7 +6181,6 @@
         <w:rPr>
           <w:bCs/>
           <w:b/>
-          <w:color w:val="E75D3C"/>
         </w:rPr>
         <w:t xml:space="preserve">Firestorm</w:t>
       </w:r>
@@ -6345,7 +6341,6 @@
         <w:rPr>
           <w:bCs/>
           <w:b/>
-          <w:color w:val="A2A7A9"/>
         </w:rPr>
         <w:t xml:space="preserve">Wall</w:t>
       </w:r>
@@ -6512,7 +6507,6 @@
         <w:rPr>
           <w:bCs/>
           <w:b/>
-          <w:color w:val="836F91"/>
         </w:rPr>
         <w:t xml:space="preserve">Phantom</w:t>
       </w:r>
@@ -6673,7 +6667,6 @@
         <w:rPr>
           <w:bCs/>
           <w:b/>
-          <w:color w:val="B93C41"/>
         </w:rPr>
         <w:t xml:space="preserve">Predator</w:t>
       </w:r>
@@ -6874,7 +6867,6 @@
         <w:rPr>
           <w:bCs/>
           <w:b/>
-          <w:color w:val="CDD3D8"/>
         </w:rPr>
         <w:t xml:space="preserve">Mirror</w:t>
       </w:r>
@@ -7047,7 +7039,6 @@
         <w:rPr>
           <w:bCs/>
           <w:b/>
-          <w:color w:val="3F4F7C"/>
         </w:rPr>
         <w:t xml:space="preserve">Judge</w:t>
       </w:r>
@@ -7414,7 +7405,6 @@
               <w:rPr>
                 <w:bCs/>
                 <w:b/>
-                <w:color w:val="A8B5C3"/>
               </w:rPr>
               <w:t xml:space="preserve">Oracle</w:t>
             </w:r>
@@ -7556,7 +7546,6 @@
               <w:rPr>
                 <w:bCs/>
                 <w:b/>
-                <w:color w:val="5C8159"/>
               </w:rPr>
               <w:t xml:space="preserve">Sentinel</w:t>
             </w:r>
@@ -7698,7 +7687,6 @@
               <w:rPr>
                 <w:bCs/>
                 <w:b/>
-                <w:color w:val="E75D3C"/>
               </w:rPr>
               <w:t xml:space="preserve">Firestorm</w:t>
             </w:r>
@@ -7840,7 +7828,6 @@
               <w:rPr>
                 <w:bCs/>
                 <w:b/>
-                <w:color w:val="A2A7A9"/>
               </w:rPr>
               <w:t xml:space="preserve">Wall</w:t>
             </w:r>
@@ -7982,7 +7969,6 @@
               <w:rPr>
                 <w:bCs/>
                 <w:b/>
-                <w:color w:val="836F91"/>
               </w:rPr>
               <w:t xml:space="preserve">Phantom</w:t>
             </w:r>
@@ -8169,7 +8155,6 @@
               <w:rPr>
                 <w:bCs/>
                 <w:b/>
-                <w:color w:val="B93C41"/>
               </w:rPr>
               <w:t xml:space="preserve">Predator</w:t>
             </w:r>
@@ -8306,7 +8291,6 @@
               <w:rPr>
                 <w:bCs/>
                 <w:b/>
-                <w:color w:val="CDD3D8"/>
               </w:rPr>
               <w:t xml:space="preserve">Mirror</w:t>
             </w:r>
@@ -8422,7 +8406,6 @@
               <w:rPr>
                 <w:bCs/>
                 <w:b/>
-                <w:color w:val="3F4F7C"/>
               </w:rPr>
               <w:t xml:space="preserve">Judge</w:t>
             </w:r>
@@ -9718,7 +9701,6 @@
           <w:b/>
           <w:iCs/>
           <w:i/>
-          <w:color w:val="5C8159"/>
         </w:rPr>
         <w:t xml:space="preserve">Sentinel</w:t>
       </w:r>
@@ -9742,7 +9724,6 @@
           <w:b/>
           <w:iCs/>
           <w:i/>
-          <w:color w:val="CDD3D8"/>
         </w:rPr>
         <w:t xml:space="preserve">Mirror</w:t>
       </w:r>
@@ -9773,7 +9754,6 @@
           <w:b/>
           <w:iCs/>
           <w:i/>
-          <w:color w:val="3F4F7C"/>
         </w:rPr>
         <w:t xml:space="preserve">Judge</w:t>
       </w:r>
@@ -11171,7 +11151,6 @@
         <w:rPr>
           <w:bCs/>
           <w:b/>
-          <w:color w:val="A2A7A9"/>
         </w:rPr>
         <w:t xml:space="preserve">Wall</w:t>
       </w:r>
@@ -11194,7 +11173,6 @@
         <w:rPr>
           <w:bCs/>
           <w:b/>
-          <w:color w:val="E75D3C"/>
         </w:rPr>
         <w:t xml:space="preserve">Firestorm</w:t>
       </w:r>
@@ -11217,7 +11195,6 @@
         <w:rPr>
           <w:bCs/>
           <w:b/>
-          <w:color w:val="E75D3C"/>
         </w:rPr>
         <w:t xml:space="preserve">Firestorm</w:t>
       </w:r>
@@ -11309,7 +11286,6 @@
         <w:rPr>
           <w:bCs/>
           <w:b/>
-          <w:color w:val="E75D3C"/>
         </w:rPr>
         <w:t xml:space="preserve">Firestorm</w:t>
       </w:r>
@@ -11429,7 +11405,6 @@
         <w:rPr>
           <w:bCs/>
           <w:b/>
-          <w:color w:val="E75D3C"/>
         </w:rPr>
         <w:t xml:space="preserve">Firestorm</w:t>
       </w:r>
@@ -11468,7 +11443,6 @@
         <w:rPr>
           <w:bCs/>
           <w:b/>
-          <w:color w:val="A2A7A9"/>
         </w:rPr>
         <w:t xml:space="preserve">Wall</w:t>
       </w:r>
@@ -11505,7 +11479,6 @@
         <w:rPr>
           <w:bCs/>
           <w:b/>
-          <w:color w:val="A2A7A9"/>
         </w:rPr>
         <w:t xml:space="preserve">Wall</w:t>
       </w:r>
@@ -11622,7 +11595,6 @@
         <w:rPr>
           <w:bCs/>
           <w:b/>
-          <w:color w:val="A2A7A9"/>
         </w:rPr>
         <w:t xml:space="preserve">Wall</w:t>
       </w:r>
@@ -11672,7 +11644,6 @@
         <w:rPr>
           <w:bCs/>
           <w:b/>
-          <w:color w:val="A2A7A9"/>
         </w:rPr>
         <w:t xml:space="preserve">Wall</w:t>
       </w:r>
@@ -11868,7 +11839,6 @@
               <w:rPr>
                 <w:bCs/>
                 <w:b/>
-                <w:color w:val="3F4F7C"/>
               </w:rPr>
               <w:t xml:space="preserve">Judge</w:t>
             </w:r>
@@ -11955,7 +11925,6 @@
               <w:rPr>
                 <w:bCs/>
                 <w:b/>
-                <w:color w:val="E75D3C"/>
               </w:rPr>
               <w:t xml:space="preserve">Firestorm</w:t>
             </w:r>
@@ -12046,7 +12015,6 @@
               <w:rPr>
                 <w:bCs/>
                 <w:b/>
-                <w:color w:val="A2A7A9"/>
               </w:rPr>
               <w:t xml:space="preserve">Wall</w:t>
             </w:r>
@@ -12141,7 +12109,6 @@
               <w:rPr>
                 <w:bCs/>
                 <w:b/>
-                <w:color w:val="3F4F7C"/>
               </w:rPr>
               <w:t xml:space="preserve">Judge</w:t>
             </w:r>
@@ -12284,7 +12251,6 @@
               <w:rPr>
                 <w:bCs/>
                 <w:b/>
-                <w:color w:val="3F4F7C"/>
               </w:rPr>
               <w:t xml:space="preserve">Judge</w:t>
             </w:r>
@@ -12301,7 +12267,6 @@
               <w:rPr>
                 <w:bCs/>
                 <w:b/>
-                <w:color w:val="E75D3C"/>
               </w:rPr>
               <w:t xml:space="preserve">Firestorm</w:t>
             </w:r>
@@ -12318,7 +12283,6 @@
               <w:rPr>
                 <w:bCs/>
                 <w:b/>
-                <w:color w:val="A2A7A9"/>
               </w:rPr>
               <w:t xml:space="preserve">Wall</w:t>
             </w:r>
@@ -12493,7 +12457,6 @@
               <w:rPr>
                 <w:bCs/>
                 <w:b/>
-                <w:color w:val="A2A7A9"/>
               </w:rPr>
               <w:t xml:space="preserve">Wall</w:t>
             </w:r>
@@ -12525,7 +12488,6 @@
         <w:rPr>
           <w:bCs/>
           <w:b/>
-          <w:color w:val="E75D3C"/>
         </w:rPr>
         <w:t xml:space="preserve">Firestorm</w:t>
       </w:r>
@@ -12584,7 +12546,6 @@
         <w:rPr>
           <w:bCs/>
           <w:b/>
-          <w:color w:val="3F4F7C"/>
         </w:rPr>
         <w:t xml:space="preserve">Judge</w:t>
       </w:r>
@@ -12627,7 +12588,6 @@
         <w:rPr>
           <w:bCs/>
           <w:b/>
-          <w:color w:val="A2A7A9"/>
         </w:rPr>
         <w:t xml:space="preserve">Wall</w:t>
       </w:r>
@@ -12735,7 +12695,6 @@
           <w:b/>
           <w:iCs/>
           <w:i/>
-          <w:color w:val="E75D3C"/>
         </w:rPr>
         <w:t xml:space="preserve">Firestorm</w:t>
       </w:r>
@@ -12801,7 +12760,6 @@
           <w:b/>
           <w:iCs/>
           <w:i/>
-          <w:color w:val="A2A7A9"/>
         </w:rPr>
         <w:t xml:space="preserve">Wall</w:t>
       </w:r>
@@ -12852,7 +12810,6 @@
         <w:rPr>
           <w:bCs/>
           <w:b/>
-          <w:color w:val="B93C41"/>
         </w:rPr>
         <w:t xml:space="preserve">Predator</w:t>
       </w:r>
@@ -12890,7 +12847,6 @@
         <w:rPr>
           <w:bCs/>
           <w:b/>
-          <w:color w:val="A2A7A9"/>
         </w:rPr>
         <w:t xml:space="preserve">Wall</w:t>
       </w:r>
@@ -12924,7 +12880,6 @@
         <w:rPr>
           <w:bCs/>
           <w:b/>
-          <w:color w:val="E75D3C"/>
         </w:rPr>
         <w:t xml:space="preserve">Firestorm</w:t>
       </w:r>
@@ -12958,7 +12913,6 @@
         <w:rPr>
           <w:bCs/>
           <w:b/>
-          <w:color w:val="836F91"/>
         </w:rPr>
         <w:t xml:space="preserve">Phantom</w:t>
       </w:r>
@@ -13010,7 +12964,6 @@
         <w:rPr>
           <w:bCs/>
           <w:b/>
-          <w:color w:val="5C8159"/>
         </w:rPr>
         <w:t xml:space="preserve">Sentinel</w:t>
       </w:r>
@@ -13024,7 +12977,6 @@
         <w:rPr>
           <w:bCs/>
           <w:b/>
-          <w:color w:val="CDD3D8"/>
         </w:rPr>
         <w:t xml:space="preserve">Mirror</w:t>
       </w:r>
@@ -13041,7 +12993,6 @@
         <w:rPr>
           <w:bCs/>
           <w:b/>
-          <w:color w:val="3F4F7C"/>
         </w:rPr>
         <w:t xml:space="preserve">Judge</w:t>
       </w:r>
@@ -14747,7 +14698,6 @@
         <w:rPr>
           <w:bCs/>
           <w:b/>
-          <w:color w:val="E75D3C"/>
         </w:rPr>
         <w:t xml:space="preserve">Firestorm</w:t>
       </w:r>
@@ -14787,7 +14737,6 @@
         <w:rPr>
           <w:bCs/>
           <w:b/>
-          <w:color w:val="A2A7A9"/>
         </w:rPr>
         <w:t xml:space="preserve">Wall</w:t>
       </w:r>
@@ -16858,7 +16807,6 @@
         <w:rPr>
           <w:bCs/>
           <w:b/>
-          <w:color w:val="A2A7A9"/>
         </w:rPr>
         <w:t xml:space="preserve">Wall</w:t>
       </w:r>
@@ -16924,7 +16872,6 @@
         <w:rPr>
           <w:bCs/>
           <w:b/>
-          <w:color w:val="E75D3C"/>
         </w:rPr>
         <w:t xml:space="preserve">Firestorm</w:t>
       </w:r>
@@ -16949,7 +16896,6 @@
         <w:rPr>
           <w:bCs/>
           <w:b/>
-          <w:color w:val="A2A7A9"/>
         </w:rPr>
         <w:t xml:space="preserve">Wall</w:t>
       </w:r>
@@ -18091,7 +18037,6 @@
         <w:rPr>
           <w:bCs/>
           <w:b/>
-          <w:color w:val="A2A7A9"/>
         </w:rPr>
         <w:t xml:space="preserve">Wall</w:t>
       </w:r>
@@ -18108,7 +18053,6 @@
         <w:rPr>
           <w:bCs/>
           <w:b/>
-          <w:color w:val="5C8159"/>
         </w:rPr>
         <w:t xml:space="preserve">Sentinel</w:t>
       </w:r>
@@ -18281,7 +18225,6 @@
         <w:rPr>
           <w:bCs/>
           <w:b/>
-          <w:color w:val="A2A7A9"/>
         </w:rPr>
         <w:t xml:space="preserve">Wall</w:t>
       </w:r>
@@ -18312,7 +18255,6 @@
         <w:rPr>
           <w:bCs/>
           <w:b/>
-          <w:color w:val="5C8159"/>
         </w:rPr>
         <w:t xml:space="preserve">Sentinel</w:t>
       </w:r>
@@ -18731,7 +18673,6 @@
         <w:rPr>
           <w:bCs/>
           <w:b/>
-          <w:color w:val="A2A7A9"/>
         </w:rPr>
         <w:t xml:space="preserve">Wall</w:t>
       </w:r>
@@ -18806,7 +18747,6 @@
         <w:rPr>
           <w:bCs/>
           <w:b/>
-          <w:color w:val="E75D3C"/>
         </w:rPr>
         <w:t xml:space="preserve">Firestorm</w:t>
       </w:r>
@@ -18820,7 +18760,6 @@
         <w:rPr>
           <w:bCs/>
           <w:b/>
-          <w:color w:val="E75D3C"/>
         </w:rPr>
         <w:t xml:space="preserve">Firestorm</w:t>
       </w:r>
@@ -18849,7 +18788,6 @@
         <w:rPr>
           <w:bCs/>
           <w:b/>
-          <w:color w:val="A2A7A9"/>
         </w:rPr>
         <w:t xml:space="preserve">Wall</w:t>
       </w:r>
@@ -18878,7 +18816,6 @@
         <w:rPr>
           <w:bCs/>
           <w:b/>
-          <w:color w:val="A2A7A9"/>
         </w:rPr>
         <w:t xml:space="preserve">Wall</w:t>
       </w:r>
@@ -18925,7 +18862,6 @@
         <w:rPr>
           <w:bCs/>
           <w:b/>
-          <w:color w:val="A2A7A9"/>
         </w:rPr>
         <w:t xml:space="preserve">Wall</w:t>
       </w:r>
@@ -19115,7 +19051,6 @@
               <w:rPr>
                 <w:bCs/>
                 <w:b/>
-                <w:color w:val="E75D3C"/>
               </w:rPr>
               <w:t xml:space="preserve">Firestorm</w:t>
             </w:r>
@@ -19202,7 +19137,6 @@
               <w:rPr>
                 <w:bCs/>
                 <w:b/>
-                <w:color w:val="A2A7A9"/>
               </w:rPr>
               <w:t xml:space="preserve">Wall</w:t>
             </w:r>
@@ -19293,7 +19227,6 @@
               <w:rPr>
                 <w:bCs/>
                 <w:b/>
-                <w:color w:val="E75D3C"/>
               </w:rPr>
               <w:t xml:space="preserve">Firestorm</w:t>
             </w:r>
@@ -19384,7 +19317,6 @@
               <w:rPr>
                 <w:bCs/>
                 <w:b/>
-                <w:color w:val="A2A7A9"/>
               </w:rPr>
               <w:t xml:space="preserve">Wall</w:t>
             </w:r>
@@ -19471,7 +19403,6 @@
               <w:rPr>
                 <w:bCs/>
                 <w:b/>
-                <w:color w:val="E75D3C"/>
               </w:rPr>
               <w:t xml:space="preserve">Firestorm</w:t>
             </w:r>
@@ -19562,7 +19493,6 @@
               <w:rPr>
                 <w:bCs/>
                 <w:b/>
-                <w:color w:val="A2A7A9"/>
               </w:rPr>
               <w:t xml:space="preserve">Wall</w:t>
             </w:r>
@@ -19649,7 +19579,6 @@
               <w:rPr>
                 <w:bCs/>
                 <w:b/>
-                <w:color w:val="E75D3C"/>
               </w:rPr>
               <w:t xml:space="preserve">Firestorm</w:t>
             </w:r>
@@ -19748,7 +19677,6 @@
               <w:rPr>
                 <w:bCs/>
                 <w:b/>
-                <w:color w:val="A2A7A9"/>
               </w:rPr>
               <w:t xml:space="preserve">Wall</w:t>
             </w:r>
@@ -19847,7 +19775,6 @@
               <w:rPr>
                 <w:bCs/>
                 <w:b/>
-                <w:color w:val="E75D3C"/>
               </w:rPr>
               <w:t xml:space="preserve">Firestorm</w:t>
             </w:r>
@@ -19929,7 +19856,6 @@
         <w:rPr>
           <w:bCs/>
           <w:b/>
-          <w:color w:val="A2A7A9"/>
         </w:rPr>
         <w:t xml:space="preserve">Wall</w:t>
       </w:r>
@@ -19988,7 +19914,6 @@
         <w:rPr>
           <w:bCs/>
           <w:b/>
-          <w:color w:val="E75D3C"/>
         </w:rPr>
         <w:t xml:space="preserve">Firestorm</w:t>
       </w:r>
@@ -20047,7 +19972,6 @@
           <w:b/>
           <w:iCs/>
           <w:i/>
-          <w:color w:val="A2A7A9"/>
         </w:rPr>
         <w:t xml:space="preserve">Wall</w:t>
       </w:r>
@@ -20092,7 +20016,6 @@
           <w:b/>
           <w:iCs/>
           <w:i/>
-          <w:color w:val="A2A7A9"/>
         </w:rPr>
         <w:t xml:space="preserve">Wall</w:t>
       </w:r>
@@ -20208,7 +20131,6 @@
         <w:rPr>
           <w:bCs/>
           <w:b/>
-          <w:color w:val="A2A7A9"/>
         </w:rPr>
         <w:t xml:space="preserve">Wall</w:t>
       </w:r>
@@ -20225,7 +20147,6 @@
         <w:rPr>
           <w:bCs/>
           <w:b/>
-          <w:color w:val="5C8159"/>
         </w:rPr>
         <w:t xml:space="preserve">Sentinel</w:t>
       </w:r>
@@ -20297,7 +20218,6 @@
         <w:rPr>
           <w:bCs/>
           <w:b/>
-          <w:color w:val="E75D3C"/>
         </w:rPr>
         <w:t xml:space="preserve">Firestorm</w:t>
       </w:r>
@@ -20353,7 +20273,6 @@
         <w:rPr>
           <w:bCs/>
           <w:b/>
-          <w:color w:val="E75D3C"/>
         </w:rPr>
         <w:t xml:space="preserve">Firestorm</w:t>
       </w:r>
@@ -20394,7 +20313,6 @@
         <w:rPr>
           <w:bCs/>
           <w:b/>
-          <w:color w:val="E75D3C"/>
         </w:rPr>
         <w:t xml:space="preserve">Firestorm</w:t>
       </w:r>
@@ -20423,7 +20341,6 @@
         <w:rPr>
           <w:bCs/>
           <w:b/>
-          <w:color w:val="CDD3D8"/>
         </w:rPr>
         <w:t xml:space="preserve">Mirror</w:t>
       </w:r>
@@ -20509,7 +20426,6 @@
         <w:rPr>
           <w:bCs/>
           <w:b/>
-          <w:color w:val="5C8159"/>
         </w:rPr>
         <w:t xml:space="preserve">Sentinel</w:t>
       </w:r>
@@ -20523,7 +20439,6 @@
         <w:rPr>
           <w:bCs/>
           <w:b/>
-          <w:color w:val="CDD3D8"/>
         </w:rPr>
         <w:t xml:space="preserve">Mirror</w:t>
       </w:r>
@@ -20537,7 +20452,6 @@
         <w:rPr>
           <w:bCs/>
           <w:b/>
-          <w:color w:val="3F4F7C"/>
         </w:rPr>
         <w:t xml:space="preserve">Judge</w:t>
       </w:r>
@@ -21361,7 +21275,6 @@
         <w:rPr>
           <w:bCs/>
           <w:b/>
-          <w:color w:val="A2A7A9"/>
         </w:rPr>
         <w:t xml:space="preserve">Wall</w:t>
       </w:r>
@@ -21384,7 +21297,6 @@
         <w:rPr>
           <w:bCs/>
           <w:b/>
-          <w:color w:val="A2A7A9"/>
         </w:rPr>
         <w:t xml:space="preserve">Wall</w:t>
       </w:r>
@@ -21401,7 +21313,6 @@
         <w:rPr>
           <w:bCs/>
           <w:b/>
-          <w:color w:val="E75D3C"/>
         </w:rPr>
         <w:t xml:space="preserve">Firestorm</w:t>
       </w:r>
@@ -21421,7 +21332,6 @@
         <w:rPr>
           <w:bCs/>
           <w:b/>
-          <w:color w:val="E75D3C"/>
         </w:rPr>
         <w:t xml:space="preserve">Firestorm</w:t>
       </w:r>
@@ -21447,7 +21357,6 @@
         <w:rPr>
           <w:bCs/>
           <w:b/>
-          <w:color w:val="A2A7A9"/>
         </w:rPr>
         <w:t xml:space="preserve">Wall</w:t>
       </w:r>
@@ -21464,7 +21373,6 @@
         <w:rPr>
           <w:bCs/>
           <w:b/>
-          <w:color w:val="A2A7A9"/>
         </w:rPr>
         <w:t xml:space="preserve">Wall</w:t>
       </w:r>
@@ -22277,7 +22185,6 @@
         <w:rPr>
           <w:bCs/>
           <w:b/>
-          <w:color w:val="A2A7A9"/>
         </w:rPr>
         <w:t xml:space="preserve">Wall</w:t>
       </w:r>

</xml_diff>

<commit_message>
docx: update \archentry renewcommand to 4 args (card ranges removed in v12)
</commit_message>
<xml_diff>
--- a/paper_resources/manuscript/main.docx
+++ b/paper_resources/manuscript/main.docx
@@ -1192,7 +1192,7 @@
         <w:t xml:space="preserve">thing?</w:t>
       </w:r>
     </w:p>
-    <w:bookmarkStart w:id="23" w:name="introduction"/>
+    <w:bookmarkStart w:id="21" w:name="introduction"/>
     <w:p>
       <w:pPr>
         <w:pStyle w:val="Heading1"/>
@@ -1467,16 +1467,7 @@
         <w:t xml:space="preserve"> </w:t>
       </w:r>
       <w:r>
-        <w:t xml:space="preserve">example, a player’s private cards</w:t>
-      </w:r>
-      <w:r>
-        <w:rPr>
-          <w:rStyle w:val="FootnoteReference"/>
-        </w:rPr>
-        <w:footnoteReference w:id="20"/>
-      </w:r>
-      <w:r>
-        <w:t xml:space="preserve">), public actions (bets, calls, and folds) were</w:t>
+        <w:t xml:space="preserve">example, a player’s private cards), public actions (bets, calls, and folds) were</w:t>
       </w:r>
       <w:r>
         <w:t xml:space="preserve"> </w:t>
@@ -1488,19 +1479,7 @@
         <w:t xml:space="preserve"> </w:t>
       </w:r>
       <w:r>
-        <w:t xml:space="preserve">Hold’em</w:t>
-      </w:r>
-      <w:r>
-        <w:rPr>
-          <w:rStyle w:val="FootnoteReference"/>
-        </w:rPr>
-        <w:footnoteReference w:id="21"/>
-      </w:r>
-      <w:r>
-        <w:t xml:space="preserve"> </w:t>
-      </w:r>
-      <w:r>
-        <w:t xml:space="preserve">was the way to go, where both the bet sizes and action</w:t>
+        <w:t xml:space="preserve">Hold’em was the way to go, where both the bet sizes and action</w:t>
       </w:r>
       <w:r>
         <w:t xml:space="preserve"> </w:t>
@@ -1619,7 +1598,7 @@
         <w:rPr>
           <w:rStyle w:val="FootnoteReference"/>
         </w:rPr>
-        <w:footnoteReference w:id="22"/>
+        <w:footnoteReference w:id="20"/>
       </w:r>
       <w:r>
         <w:t xml:space="preserve"> </w:t>
@@ -1658,8 +1637,8 @@
         <w:t xml:space="preserve">work presented in the following section.</w:t>
       </w:r>
     </w:p>
-    <w:bookmarkEnd w:id="23"/>
-    <w:bookmarkStart w:id="33" w:name="background"/>
+    <w:bookmarkEnd w:id="21"/>
+    <w:bookmarkStart w:id="31" w:name="background"/>
     <w:p>
       <w:pPr>
         <w:pStyle w:val="Heading1"/>
@@ -1785,7 +1764,7 @@
         <w:t xml:space="preserve">it?</w:t>
       </w:r>
     </w:p>
-    <w:bookmarkStart w:id="27" w:name="online-reputation-systems"/>
+    <w:bookmarkStart w:id="25" w:name="online-reputation-systems"/>
     <w:p>
       <w:pPr>
         <w:pStyle w:val="Heading2"/>
@@ -2276,18 +2255,18 @@
           <wp:inline>
             <wp:extent cx="5039999" cy="3662663"/>
             <wp:effectExtent b="0" l="0" r="0" t="0"/>
-            <wp:docPr descr="" title="" id="25" name="Picture"/>
+            <wp:docPr descr="" title="" id="23" name="Picture"/>
             <a:graphic>
               <a:graphicData uri="http://schemas.openxmlformats.org/drawingml/2006/picture">
                 <pic:pic>
                   <pic:nvPicPr>
-                    <pic:cNvPr descr="00_game_of_trust.png" id="26" name="Picture"/>
+                    <pic:cNvPr descr="00_game_of_trust.png" id="24" name="Picture"/>
                     <pic:cNvPicPr>
                       <a:picLocks noChangeArrowheads="1" noChangeAspect="1"/>
                     </pic:cNvPicPr>
                   </pic:nvPicPr>
                   <pic:blipFill>
-                    <a:blip r:embed="rId24"/>
+                    <a:blip r:embed="rId22"/>
                     <a:stretch>
                       <a:fillRect/>
                     </a:stretch>
@@ -2462,8 +2441,8 @@
         <w:t xml:space="preserve">to the cooperator.</w:t>
       </w:r>
     </w:p>
-    <w:bookmarkEnd w:id="27"/>
-    <w:bookmarkStart w:id="29" w:name="cooperation-in-repeated-games"/>
+    <w:bookmarkEnd w:id="25"/>
+    <w:bookmarkStart w:id="27" w:name="cooperation-in-repeated-games"/>
     <w:p>
       <w:pPr>
         <w:pStyle w:val="Heading2"/>
@@ -2842,7 +2821,7 @@
         <w:rPr>
           <w:rStyle w:val="FootnoteReference"/>
         </w:rPr>
-        <w:footnoteReference w:id="28"/>
+        <w:footnoteReference w:id="26"/>
       </w:r>
       <w:r>
         <w:t xml:space="preserve"> </w:t>
@@ -2900,8 +2879,8 @@
         <w:t xml:space="preserve">suggestive rather than definitive.</w:t>
       </w:r>
     </w:p>
-    <w:bookmarkEnd w:id="29"/>
-    <w:bookmarkStart w:id="30" w:name="bayesian-opponent-modelling-in-poker"/>
+    <w:bookmarkEnd w:id="27"/>
+    <w:bookmarkStart w:id="28" w:name="bayesian-opponent-modelling-in-poker"/>
     <w:p>
       <w:pPr>
         <w:pStyle w:val="Heading2"/>
@@ -3044,8 +3023,8 @@
         <w:t xml:space="preserve">as a microscope—not as an adversary.</w:t>
       </w:r>
     </w:p>
-    <w:bookmarkEnd w:id="30"/>
-    <w:bookmarkStart w:id="31" w:name="language-models-as-strategic-agents"/>
+    <w:bookmarkEnd w:id="28"/>
+    <w:bookmarkStart w:id="29" w:name="language-models-as-strategic-agents"/>
     <w:p>
       <w:pPr>
         <w:pStyle w:val="Heading2"/>
@@ -3149,8 +3128,8 @@
         <w:t xml:space="preserve">represent by way of textual strategies.</w:t>
       </w:r>
     </w:p>
-    <w:bookmarkEnd w:id="31"/>
-    <w:bookmarkStart w:id="32" w:name="ideas-in-mathematics-used-throughout"/>
+    <w:bookmarkEnd w:id="29"/>
+    <w:bookmarkStart w:id="30" w:name="ideas-in-mathematics-used-throughout"/>
     <w:p>
       <w:pPr>
         <w:pStyle w:val="Heading2"/>
@@ -4201,9 +4180,9 @@
         <w:t xml:space="preserve">all four lines of prior work and using these two mathematical tools.</w:t>
       </w:r>
     </w:p>
-    <w:bookmarkEnd w:id="32"/>
-    <w:bookmarkEnd w:id="33"/>
-    <w:bookmarkStart w:id="49" w:name="methodology"/>
+    <w:bookmarkEnd w:id="30"/>
+    <w:bookmarkEnd w:id="31"/>
+    <w:bookmarkStart w:id="43" w:name="methodology"/>
     <w:p>
       <w:pPr>
         <w:pStyle w:val="Heading1"/>
@@ -4335,7 +4314,7 @@
         <w:t xml:space="preserve">four agent implementations.</w:t>
       </w:r>
     </w:p>
-    <w:bookmarkStart w:id="38" w:name="game-environment"/>
+    <w:bookmarkStart w:id="33" w:name="game-environment"/>
     <w:p>
       <w:pPr>
         <w:pStyle w:val="Heading2"/>
@@ -4391,85 +4370,67 @@
         <w:t xml:space="preserve">”</w:t>
       </w:r>
       <w:r>
+        <w:t xml:space="preserve">), the large bet (4) can be made on the</w:t>
+      </w:r>
+      <w:r>
+        <w:t xml:space="preserve"> </w:t>
+      </w:r>
+      <w:r>
+        <w:t xml:space="preserve">second round of cards (</w:t>
+      </w:r>
+      <w:r>
+        <w:t xml:space="preserve">“</w:t>
+      </w:r>
+      <w:r>
+        <w:t xml:space="preserve">turn</w:t>
+      </w:r>
+      <w:r>
+        <w:t xml:space="preserve">”</w:t>
+      </w:r>
+      <w:r>
+        <w:t xml:space="preserve">) and third round of cards</w:t>
+      </w:r>
+      <w:r>
+        <w:t xml:space="preserve"> </w:t>
+      </w:r>
+      <w:r>
+        <w:t xml:space="preserve">(</w:t>
+      </w:r>
+      <w:r>
+        <w:t xml:space="preserve">“</w:t>
+      </w:r>
+      <w:r>
+        <w:t xml:space="preserve">river</w:t>
+      </w:r>
+      <w:r>
+        <w:t xml:space="preserve">”</w:t>
+      </w:r>
+      <w:r>
+        <w:t xml:space="preserve">). There is a cap of four-bet allowed per round. At the beginning of each</w:t>
+      </w:r>
+      <w:r>
+        <w:t xml:space="preserve"> </w:t>
+      </w:r>
+      <w:r>
+        <w:t xml:space="preserve">hand, each player has a chip count of 200 in their respective seat,</w:t>
+      </w:r>
+      <w:r>
+        <w:t xml:space="preserve"> </w:t>
+      </w:r>
+      <w:r>
+        <w:t xml:space="preserve">and when a player’s chips run out, he/she receives a rebuy. Side</w:t>
+      </w:r>
+      <w:r>
+        <w:t xml:space="preserve"> </w:t>
+      </w:r>
+      <w:r>
+        <w:t xml:space="preserve">pots</w:t>
+      </w:r>
+      <w:r>
         <w:rPr>
           <w:rStyle w:val="FootnoteReference"/>
         </w:rPr>
-        <w:footnoteReference w:id="34"/>
-      </w:r>
-      <w:r>
-        <w:t xml:space="preserve">), the large bet (4) can be made on the</w:t>
-      </w:r>
-      <w:r>
-        <w:t xml:space="preserve"> </w:t>
-      </w:r>
-      <w:r>
-        <w:t xml:space="preserve">second round of cards (</w:t>
-      </w:r>
-      <w:r>
-        <w:t xml:space="preserve">“</w:t>
-      </w:r>
-      <w:r>
-        <w:t xml:space="preserve">turn</w:t>
-      </w:r>
-      <w:r>
-        <w:t xml:space="preserve">”</w:t>
-      </w:r>
-      <w:r>
-        <w:t xml:space="preserve">) and third round of cards</w:t>
-      </w:r>
-      <w:r>
-        <w:t xml:space="preserve"> </w:t>
-      </w:r>
-      <w:r>
-        <w:t xml:space="preserve">(</w:t>
-      </w:r>
-      <w:r>
-        <w:t xml:space="preserve">“</w:t>
-      </w:r>
-      <w:r>
-        <w:t xml:space="preserve">river</w:t>
-      </w:r>
-      <w:r>
-        <w:t xml:space="preserve">”</w:t>
-      </w:r>
-      <w:r>
-        <w:t xml:space="preserve">). There is a cap of four-bet</w:t>
-      </w:r>
-      <w:r>
-        <w:rPr>
-          <w:rStyle w:val="FootnoteReference"/>
-        </w:rPr>
-        <w:footnoteReference w:id="35"/>
-      </w:r>
-      <w:r>
-        <w:t xml:space="preserve"> </w:t>
-      </w:r>
-      <w:r>
-        <w:t xml:space="preserve">allowed per round. At the beginning of each</w:t>
-      </w:r>
-      <w:r>
-        <w:t xml:space="preserve"> </w:t>
-      </w:r>
-      <w:r>
-        <w:t xml:space="preserve">hand, each player has a chip count of 200 in their respective seat,</w:t>
-      </w:r>
-      <w:r>
-        <w:t xml:space="preserve"> </w:t>
-      </w:r>
-      <w:r>
-        <w:t xml:space="preserve">and when a player’s chips run out, he/she receives a rebuy. Side</w:t>
-      </w:r>
-      <w:r>
-        <w:t xml:space="preserve"> </w:t>
-      </w:r>
-      <w:r>
-        <w:t xml:space="preserve">pots</w:t>
-      </w:r>
-      <w:r>
-        <w:rPr>
-          <w:rStyle w:val="FootnoteReference"/>
-        </w:rPr>
-        <w:footnoteReference w:id="36"/>
+        <w:footnoteReference w:id="32"/>
       </w:r>
       <w:r>
         <w:t xml:space="preserve"> </w:t>
@@ -4481,16 +4442,7 @@
         <w:t xml:space="preserve"> </w:t>
       </w:r>
       <w:r>
-        <w:t xml:space="preserve">showdown</w:t>
-      </w:r>
-      <w:r>
-        <w:rPr>
-          <w:rStyle w:val="FootnoteReference"/>
-        </w:rPr>
-        <w:footnoteReference w:id="37"/>
-      </w:r>
-      <w:r>
-        <w:t xml:space="preserve">; a side pot is created by</w:t>
+        <w:t xml:space="preserve">showdown; a side pot is created by</w:t>
       </w:r>
       <w:r>
         <w:t xml:space="preserve"> </w:t>
@@ -4517,8 +4469,8 @@
         <w:t xml:space="preserve">comes first from the dealer, going in clockwise direction.</w:t>
       </w:r>
     </w:p>
-    <w:bookmarkEnd w:id="38"/>
-    <w:bookmarkStart w:id="40" w:name="the-eight-agent-archetypes"/>
+    <w:bookmarkEnd w:id="33"/>
+    <w:bookmarkStart w:id="34" w:name="the-eight-agent-archetypes"/>
     <w:p>
       <w:pPr>
         <w:pStyle w:val="Heading2"/>
@@ -4694,31 +4646,19 @@
         <w:t xml:space="preserve"> </w:t>
       </w:r>
       <w:r>
-        <w:t xml:space="preserve">time. The preflop betting range</w:t>
-      </w:r>
-      <w:r>
-        <w:rPr>
-          <w:rStyle w:val="FootnoteReference"/>
-        </w:rPr>
-        <w:footnoteReference w:id="39"/>
-      </w:r>
-      <w:r>
-        <w:t xml:space="preserve"> </w:t>
-      </w:r>
-      <w:r>
-        <w:t xml:space="preserve">for each of the eight types</w:t>
-      </w:r>
-      <w:r>
-        <w:t xml:space="preserve"> </w:t>
-      </w:r>
-      <w:r>
-        <w:t xml:space="preserve">appears below; additional information about the policy limits per</w:t>
-      </w:r>
-      <w:r>
-        <w:t xml:space="preserve"> </w:t>
-      </w:r>
-      <w:r>
-        <w:t xml:space="preserve">type is found in Table 2.</w:t>
+        <w:t xml:space="preserve">time. The full per-archetype policy bounds—bet, bluff, and fold</w:t>
+      </w:r>
+      <w:r>
+        <w:t xml:space="preserve"> </w:t>
+      </w:r>
+      <w:r>
+        <w:t xml:space="preserve">probabilities and the adaptation rule for each of the eight</w:t>
+      </w:r>
+      <w:r>
+        <w:t xml:space="preserve"> </w:t>
+      </w:r>
+      <w:r>
+        <w:t xml:space="preserve">types—are given in Table 2.</w:t>
       </w:r>
     </w:p>
     <w:p>
@@ -4788,121 +4728,7 @@
         <w:t xml:space="preserve"> </w:t>
       </w:r>
       <w:r>
-        <w:t xml:space="preserve">evaluated. (br</w:t>
-      </w:r>
-      <w:r>
-        <w:t xml:space="preserve"> </w:t>
-      </w:r>
-      <m:oMath>
-        <m:r>
-          <m:rPr>
-            <m:sty m:val="p"/>
-          </m:rPr>
-          <m:t>∈</m:t>
-        </m:r>
-        <m:d>
-          <m:dPr>
-            <m:begChr m:val="["/>
-            <m:endChr m:val="]"/>
-            <m:sepChr m:val=""/>
-            <m:grow/>
-          </m:dPr>
-          <m:e>
-            <m:r>
-              <m:t>.20</m:t>
-            </m:r>
-            <m:r>
-              <m:rPr>
-                <m:sty m:val="p"/>
-              </m:rPr>
-              <m:t>,</m:t>
-            </m:r>
-            <m:r>
-              <m:t>.45</m:t>
-            </m:r>
-          </m:e>
-        </m:d>
-      </m:oMath>
-      <w:r>
-        <w:t xml:space="preserve"> </w:t>
-      </w:r>
-      <w:r>
-        <w:t xml:space="preserve">vbr</w:t>
-      </w:r>
-      <w:r>
-        <w:t xml:space="preserve"> </w:t>
-      </w:r>
-      <m:oMath>
-        <m:r>
-          <m:rPr>
-            <m:sty m:val="p"/>
-          </m:rPr>
-          <m:t>∈</m:t>
-        </m:r>
-        <m:d>
-          <m:dPr>
-            <m:begChr m:val="["/>
-            <m:endChr m:val="]"/>
-            <m:sepChr m:val=""/>
-            <m:grow/>
-          </m:dPr>
-          <m:e>
-            <m:r>
-              <m:t>.80</m:t>
-            </m:r>
-            <m:r>
-              <m:rPr>
-                <m:sty m:val="p"/>
-              </m:rPr>
-              <m:t>,</m:t>
-            </m:r>
-            <m:r>
-              <m:t>1.00</m:t>
-            </m:r>
-          </m:e>
-        </m:d>
-      </m:oMath>
-      <w:r>
-        <w:t xml:space="preserve"> </w:t>
-      </w:r>
-      <w:r>
-        <w:t xml:space="preserve">cr</w:t>
-      </w:r>
-      <w:r>
-        <w:t xml:space="preserve"> </w:t>
-      </w:r>
-      <m:oMath>
-        <m:r>
-          <m:rPr>
-            <m:sty m:val="p"/>
-          </m:rPr>
-          <m:t>∈</m:t>
-        </m:r>
-        <m:d>
-          <m:dPr>
-            <m:begChr m:val="["/>
-            <m:endChr m:val="]"/>
-            <m:sepChr m:val=""/>
-            <m:grow/>
-          </m:dPr>
-          <m:e>
-            <m:r>
-              <m:t>.20</m:t>
-            </m:r>
-            <m:r>
-              <m:rPr>
-                <m:sty m:val="p"/>
-              </m:rPr>
-              <m:t>,</m:t>
-            </m:r>
-            <m:r>
-              <m:t>.50</m:t>
-            </m:r>
-          </m:e>
-        </m:d>
-      </m:oMath>
-      <w:r>
-        <w:t xml:space="preserve">)</w:t>
+        <w:t xml:space="preserve">evaluated.</w:t>
       </w:r>
     </w:p>
     <w:p>
@@ -4948,121 +4774,7 @@
         <w:t xml:space="preserve"> </w:t>
       </w:r>
       <w:r>
-        <w:t xml:space="preserve">that its check is weak. (br</w:t>
-      </w:r>
-      <w:r>
-        <w:t xml:space="preserve"> </w:t>
-      </w:r>
-      <m:oMath>
-        <m:r>
-          <m:rPr>
-            <m:sty m:val="p"/>
-          </m:rPr>
-          <m:t>∈</m:t>
-        </m:r>
-        <m:d>
-          <m:dPr>
-            <m:begChr m:val="["/>
-            <m:endChr m:val="]"/>
-            <m:sepChr m:val=""/>
-            <m:grow/>
-          </m:dPr>
-          <m:e>
-            <m:r>
-              <m:t>.02</m:t>
-            </m:r>
-            <m:r>
-              <m:rPr>
-                <m:sty m:val="p"/>
-              </m:rPr>
-              <m:t>,</m:t>
-            </m:r>
-            <m:r>
-              <m:t>.18</m:t>
-            </m:r>
-          </m:e>
-        </m:d>
-      </m:oMath>
-      <w:r>
-        <w:t xml:space="preserve"> </w:t>
-      </w:r>
-      <w:r>
-        <w:t xml:space="preserve">vbr</w:t>
-      </w:r>
-      <w:r>
-        <w:t xml:space="preserve"> </w:t>
-      </w:r>
-      <m:oMath>
-        <m:r>
-          <m:rPr>
-            <m:sty m:val="p"/>
-          </m:rPr>
-          <m:t>∈</m:t>
-        </m:r>
-        <m:d>
-          <m:dPr>
-            <m:begChr m:val="["/>
-            <m:endChr m:val="]"/>
-            <m:sepChr m:val=""/>
-            <m:grow/>
-          </m:dPr>
-          <m:e>
-            <m:r>
-              <m:t>.85</m:t>
-            </m:r>
-            <m:r>
-              <m:rPr>
-                <m:sty m:val="p"/>
-              </m:rPr>
-              <m:t>,</m:t>
-            </m:r>
-            <m:r>
-              <m:t>1.00</m:t>
-            </m:r>
-          </m:e>
-        </m:d>
-      </m:oMath>
-      <w:r>
-        <w:t xml:space="preserve"> </w:t>
-      </w:r>
-      <w:r>
-        <w:t xml:space="preserve">cr</w:t>
-      </w:r>
-      <w:r>
-        <w:t xml:space="preserve"> </w:t>
-      </w:r>
-      <m:oMath>
-        <m:r>
-          <m:rPr>
-            <m:sty m:val="p"/>
-          </m:rPr>
-          <m:t>∈</m:t>
-        </m:r>
-        <m:d>
-          <m:dPr>
-            <m:begChr m:val="["/>
-            <m:endChr m:val="]"/>
-            <m:sepChr m:val=""/>
-            <m:grow/>
-          </m:dPr>
-          <m:e>
-            <m:r>
-              <m:t>.25</m:t>
-            </m:r>
-            <m:r>
-              <m:rPr>
-                <m:sty m:val="p"/>
-              </m:rPr>
-              <m:t>,</m:t>
-            </m:r>
-            <m:r>
-              <m:t>.50</m:t>
-            </m:r>
-          </m:e>
-        </m:d>
-      </m:oMath>
-      <w:r>
-        <w:t xml:space="preserve">)</w:t>
+        <w:t xml:space="preserve">that its check is weak.</w:t>
       </w:r>
     </w:p>
     <w:p>
@@ -5108,121 +4820,7 @@
         <w:t xml:space="preserve"> </w:t>
       </w:r>
       <w:r>
-        <w:t xml:space="preserve">winning at showdown. (br</w:t>
-      </w:r>
-      <w:r>
-        <w:t xml:space="preserve"> </w:t>
-      </w:r>
-      <m:oMath>
-        <m:r>
-          <m:rPr>
-            <m:sty m:val="p"/>
-          </m:rPr>
-          <m:t>∈</m:t>
-        </m:r>
-        <m:d>
-          <m:dPr>
-            <m:begChr m:val="["/>
-            <m:endChr m:val="]"/>
-            <m:sepChr m:val=""/>
-            <m:grow/>
-          </m:dPr>
-          <m:e>
-            <m:r>
-              <m:t>.40</m:t>
-            </m:r>
-            <m:r>
-              <m:rPr>
-                <m:sty m:val="p"/>
-              </m:rPr>
-              <m:t>,</m:t>
-            </m:r>
-            <m:r>
-              <m:t>.95</m:t>
-            </m:r>
-          </m:e>
-        </m:d>
-      </m:oMath>
-      <w:r>
-        <w:t xml:space="preserve"> </w:t>
-      </w:r>
-      <w:r>
-        <w:t xml:space="preserve">vbr</w:t>
-      </w:r>
-      <w:r>
-        <w:t xml:space="preserve"> </w:t>
-      </w:r>
-      <m:oMath>
-        <m:r>
-          <m:rPr>
-            <m:sty m:val="p"/>
-          </m:rPr>
-          <m:t>∈</m:t>
-        </m:r>
-        <m:d>
-          <m:dPr>
-            <m:begChr m:val="["/>
-            <m:endChr m:val="]"/>
-            <m:sepChr m:val=""/>
-            <m:grow/>
-          </m:dPr>
-          <m:e>
-            <m:r>
-              <m:t>.85</m:t>
-            </m:r>
-            <m:r>
-              <m:rPr>
-                <m:sty m:val="p"/>
-              </m:rPr>
-              <m:t>,</m:t>
-            </m:r>
-            <m:r>
-              <m:t>1.00</m:t>
-            </m:r>
-          </m:e>
-        </m:d>
-      </m:oMath>
-      <w:r>
-        <w:t xml:space="preserve"> </w:t>
-      </w:r>
-      <w:r>
-        <w:t xml:space="preserve">cr</w:t>
-      </w:r>
-      <w:r>
-        <w:t xml:space="preserve"> </w:t>
-      </w:r>
-      <m:oMath>
-        <m:r>
-          <m:rPr>
-            <m:sty m:val="p"/>
-          </m:rPr>
-          <m:t>∈</m:t>
-        </m:r>
-        <m:d>
-          <m:dPr>
-            <m:begChr m:val="["/>
-            <m:endChr m:val="]"/>
-            <m:sepChr m:val=""/>
-            <m:grow/>
-          </m:dPr>
-          <m:e>
-            <m:r>
-              <m:t>.45</m:t>
-            </m:r>
-            <m:r>
-              <m:rPr>
-                <m:sty m:val="p"/>
-              </m:rPr>
-              <m:t>,</m:t>
-            </m:r>
-            <m:r>
-              <m:t>.90</m:t>
-            </m:r>
-          </m:e>
-        </m:d>
-      </m:oMath>
-      <w:r>
-        <w:t xml:space="preserve">)</w:t>
+        <w:t xml:space="preserve">winning at showdown.</w:t>
       </w:r>
     </w:p>
     <w:p>
@@ -5274,121 +4872,7 @@
         <w:t xml:space="preserve"> </w:t>
       </w:r>
       <w:r>
-        <w:t xml:space="preserve">reason. (br</w:t>
-      </w:r>
-      <w:r>
-        <w:t xml:space="preserve"> </w:t>
-      </w:r>
-      <m:oMath>
-        <m:r>
-          <m:rPr>
-            <m:sty m:val="p"/>
-          </m:rPr>
-          <m:t>∈</m:t>
-        </m:r>
-        <m:d>
-          <m:dPr>
-            <m:begChr m:val="["/>
-            <m:endChr m:val="]"/>
-            <m:sepChr m:val=""/>
-            <m:grow/>
-          </m:dPr>
-          <m:e>
-            <m:r>
-              <m:t>.00</m:t>
-            </m:r>
-            <m:r>
-              <m:rPr>
-                <m:sty m:val="p"/>
-              </m:rPr>
-              <m:t>,</m:t>
-            </m:r>
-            <m:r>
-              <m:t>.05</m:t>
-            </m:r>
-          </m:e>
-        </m:d>
-      </m:oMath>
-      <w:r>
-        <w:t xml:space="preserve"> </w:t>
-      </w:r>
-      <w:r>
-        <w:t xml:space="preserve">vbr</w:t>
-      </w:r>
-      <w:r>
-        <w:t xml:space="preserve"> </w:t>
-      </w:r>
-      <m:oMath>
-        <m:r>
-          <m:rPr>
-            <m:sty m:val="p"/>
-          </m:rPr>
-          <m:t>∈</m:t>
-        </m:r>
-        <m:d>
-          <m:dPr>
-            <m:begChr m:val="["/>
-            <m:endChr m:val="]"/>
-            <m:sepChr m:val=""/>
-            <m:grow/>
-          </m:dPr>
-          <m:e>
-            <m:r>
-              <m:t>.40</m:t>
-            </m:r>
-            <m:r>
-              <m:rPr>
-                <m:sty m:val="p"/>
-              </m:rPr>
-              <m:t>,</m:t>
-            </m:r>
-            <m:r>
-              <m:t>.75</m:t>
-            </m:r>
-          </m:e>
-        </m:d>
-      </m:oMath>
-      <w:r>
-        <w:t xml:space="preserve"> </w:t>
-      </w:r>
-      <w:r>
-        <w:t xml:space="preserve">cr</w:t>
-      </w:r>
-      <w:r>
-        <w:t xml:space="preserve"> </w:t>
-      </w:r>
-      <m:oMath>
-        <m:r>
-          <m:rPr>
-            <m:sty m:val="p"/>
-          </m:rPr>
-          <m:t>∈</m:t>
-        </m:r>
-        <m:d>
-          <m:dPr>
-            <m:begChr m:val="["/>
-            <m:endChr m:val="]"/>
-            <m:sepChr m:val=""/>
-            <m:grow/>
-          </m:dPr>
-          <m:e>
-            <m:r>
-              <m:t>.65</m:t>
-            </m:r>
-            <m:r>
-              <m:rPr>
-                <m:sty m:val="p"/>
-              </m:rPr>
-              <m:t>,</m:t>
-            </m:r>
-            <m:r>
-              <m:t>.95</m:t>
-            </m:r>
-          </m:e>
-        </m:d>
-      </m:oMath>
-      <w:r>
-        <w:t xml:space="preserve">)</w:t>
+        <w:t xml:space="preserve">reason.</w:t>
       </w:r>
     </w:p>
     <w:p>
@@ -5434,121 +4918,7 @@
         <w:t xml:space="preserve"> </w:t>
       </w:r>
       <w:r>
-        <w:t xml:space="preserve">space. (br</w:t>
-      </w:r>
-      <w:r>
-        <w:t xml:space="preserve"> </w:t>
-      </w:r>
-      <m:oMath>
-        <m:r>
-          <m:rPr>
-            <m:sty m:val="p"/>
-          </m:rPr>
-          <m:t>∈</m:t>
-        </m:r>
-        <m:d>
-          <m:dPr>
-            <m:begChr m:val="["/>
-            <m:endChr m:val="]"/>
-            <m:sepChr m:val=""/>
-            <m:grow/>
-          </m:dPr>
-          <m:e>
-            <m:r>
-              <m:t>.35</m:t>
-            </m:r>
-            <m:r>
-              <m:rPr>
-                <m:sty m:val="p"/>
-              </m:rPr>
-              <m:t>,</m:t>
-            </m:r>
-            <m:r>
-              <m:t>.85</m:t>
-            </m:r>
-          </m:e>
-        </m:d>
-      </m:oMath>
-      <w:r>
-        <w:t xml:space="preserve"> </w:t>
-      </w:r>
-      <w:r>
-        <w:t xml:space="preserve">vbr</w:t>
-      </w:r>
-      <w:r>
-        <w:t xml:space="preserve"> </w:t>
-      </w:r>
-      <m:oMath>
-        <m:r>
-          <m:rPr>
-            <m:sty m:val="p"/>
-          </m:rPr>
-          <m:t>∈</m:t>
-        </m:r>
-        <m:d>
-          <m:dPr>
-            <m:begChr m:val="["/>
-            <m:endChr m:val="]"/>
-            <m:sepChr m:val=""/>
-            <m:grow/>
-          </m:dPr>
-          <m:e>
-            <m:r>
-              <m:t>.45</m:t>
-            </m:r>
-            <m:r>
-              <m:rPr>
-                <m:sty m:val="p"/>
-              </m:rPr>
-              <m:t>,</m:t>
-            </m:r>
-            <m:r>
-              <m:t>.85</m:t>
-            </m:r>
-          </m:e>
-        </m:d>
-      </m:oMath>
-      <w:r>
-        <w:t xml:space="preserve"> </w:t>
-      </w:r>
-      <w:r>
-        <w:t xml:space="preserve">cr</w:t>
-      </w:r>
-      <w:r>
-        <w:t xml:space="preserve"> </w:t>
-      </w:r>
-      <m:oMath>
-        <m:r>
-          <m:rPr>
-            <m:sty m:val="p"/>
-          </m:rPr>
-          <m:t>∈</m:t>
-        </m:r>
-        <m:d>
-          <m:dPr>
-            <m:begChr m:val="["/>
-            <m:endChr m:val="]"/>
-            <m:sepChr m:val=""/>
-            <m:grow/>
-          </m:dPr>
-          <m:e>
-            <m:r>
-              <m:t>.10</m:t>
-            </m:r>
-            <m:r>
-              <m:rPr>
-                <m:sty m:val="p"/>
-              </m:rPr>
-              <m:t>,</m:t>
-            </m:r>
-            <m:r>
-              <m:t>.45</m:t>
-            </m:r>
-          </m:e>
-        </m:d>
-      </m:oMath>
-      <w:r>
-        <w:t xml:space="preserve">)</w:t>
+        <w:t xml:space="preserve">space.</w:t>
       </w:r>
     </w:p>
     <w:p>
@@ -5634,121 +5004,7 @@
         <w:t xml:space="preserve"> </w:t>
       </w:r>
       <w:r>
-        <w:t xml:space="preserve">Sentinel. (br</w:t>
-      </w:r>
-      <w:r>
-        <w:t xml:space="preserve"> </w:t>
-      </w:r>
-      <m:oMath>
-        <m:r>
-          <m:rPr>
-            <m:sty m:val="p"/>
-          </m:rPr>
-          <m:t>∈</m:t>
-        </m:r>
-        <m:d>
-          <m:dPr>
-            <m:begChr m:val="["/>
-            <m:endChr m:val="]"/>
-            <m:sepChr m:val=""/>
-            <m:grow/>
-          </m:dPr>
-          <m:e>
-            <m:r>
-              <m:t>.10</m:t>
-            </m:r>
-            <m:r>
-              <m:rPr>
-                <m:sty m:val="p"/>
-              </m:rPr>
-              <m:t>,</m:t>
-            </m:r>
-            <m:r>
-              <m:t>.40</m:t>
-            </m:r>
-          </m:e>
-        </m:d>
-      </m:oMath>
-      <w:r>
-        <w:t xml:space="preserve"> </w:t>
-      </w:r>
-      <w:r>
-        <w:t xml:space="preserve">vbr</w:t>
-      </w:r>
-      <w:r>
-        <w:t xml:space="preserve"> </w:t>
-      </w:r>
-      <m:oMath>
-        <m:r>
-          <m:rPr>
-            <m:sty m:val="p"/>
-          </m:rPr>
-          <m:t>∈</m:t>
-        </m:r>
-        <m:d>
-          <m:dPr>
-            <m:begChr m:val="["/>
-            <m:endChr m:val="]"/>
-            <m:sepChr m:val=""/>
-            <m:grow/>
-          </m:dPr>
-          <m:e>
-            <m:r>
-              <m:t>.75</m:t>
-            </m:r>
-            <m:r>
-              <m:rPr>
-                <m:sty m:val="p"/>
-              </m:rPr>
-              <m:t>,</m:t>
-            </m:r>
-            <m:r>
-              <m:t>1.00</m:t>
-            </m:r>
-          </m:e>
-        </m:d>
-      </m:oMath>
-      <w:r>
-        <w:t xml:space="preserve"> </w:t>
-      </w:r>
-      <w:r>
-        <w:t xml:space="preserve">cr</w:t>
-      </w:r>
-      <w:r>
-        <w:t xml:space="preserve"> </w:t>
-      </w:r>
-      <m:oMath>
-        <m:r>
-          <m:rPr>
-            <m:sty m:val="p"/>
-          </m:rPr>
-          <m:t>∈</m:t>
-        </m:r>
-        <m:d>
-          <m:dPr>
-            <m:begChr m:val="["/>
-            <m:endChr m:val="]"/>
-            <m:sepChr m:val=""/>
-            <m:grow/>
-          </m:dPr>
-          <m:e>
-            <m:r>
-              <m:t>.20</m:t>
-            </m:r>
-            <m:r>
-              <m:rPr>
-                <m:sty m:val="p"/>
-              </m:rPr>
-              <m:t>,</m:t>
-            </m:r>
-            <m:r>
-              <m:t>.50</m:t>
-            </m:r>
-          </m:e>
-        </m:d>
-      </m:oMath>
-      <w:r>
-        <w:t xml:space="preserve">)</w:t>
+        <w:t xml:space="preserve">Sentinel.</w:t>
       </w:r>
     </w:p>
     <w:p>
@@ -5806,121 +5062,7 @@
         <w:t xml:space="preserve"> </w:t>
       </w:r>
       <w:r>
-        <w:t xml:space="preserve">games. (br</w:t>
-      </w:r>
-      <w:r>
-        <w:t xml:space="preserve"> </w:t>
-      </w:r>
-      <m:oMath>
-        <m:r>
-          <m:rPr>
-            <m:sty m:val="p"/>
-          </m:rPr>
-          <m:t>∈</m:t>
-        </m:r>
-        <m:d>
-          <m:dPr>
-            <m:begChr m:val="["/>
-            <m:endChr m:val="]"/>
-            <m:sepChr m:val=""/>
-            <m:grow/>
-          </m:dPr>
-          <m:e>
-            <m:r>
-              <m:t>.03</m:t>
-            </m:r>
-            <m:r>
-              <m:rPr>
-                <m:sty m:val="p"/>
-              </m:rPr>
-              <m:t>,</m:t>
-            </m:r>
-            <m:r>
-              <m:t>.25</m:t>
-            </m:r>
-          </m:e>
-        </m:d>
-      </m:oMath>
-      <w:r>
-        <w:t xml:space="preserve"> </w:t>
-      </w:r>
-      <w:r>
-        <w:t xml:space="preserve">vbr</w:t>
-      </w:r>
-      <w:r>
-        <w:t xml:space="preserve"> </w:t>
-      </w:r>
-      <m:oMath>
-        <m:r>
-          <m:rPr>
-            <m:sty m:val="p"/>
-          </m:rPr>
-          <m:t>∈</m:t>
-        </m:r>
-        <m:d>
-          <m:dPr>
-            <m:begChr m:val="["/>
-            <m:endChr m:val="]"/>
-            <m:sepChr m:val=""/>
-            <m:grow/>
-          </m:dPr>
-          <m:e>
-            <m:r>
-              <m:t>.75</m:t>
-            </m:r>
-            <m:r>
-              <m:rPr>
-                <m:sty m:val="p"/>
-              </m:rPr>
-              <m:t>,</m:t>
-            </m:r>
-            <m:r>
-              <m:t>1.00</m:t>
-            </m:r>
-          </m:e>
-        </m:d>
-      </m:oMath>
-      <w:r>
-        <w:t xml:space="preserve"> </w:t>
-      </w:r>
-      <w:r>
-        <w:t xml:space="preserve">cr</w:t>
-      </w:r>
-      <w:r>
-        <w:t xml:space="preserve"> </w:t>
-      </w:r>
-      <m:oMath>
-        <m:r>
-          <m:rPr>
-            <m:sty m:val="p"/>
-          </m:rPr>
-          <m:t>∈</m:t>
-        </m:r>
-        <m:d>
-          <m:dPr>
-            <m:begChr m:val="["/>
-            <m:endChr m:val="]"/>
-            <m:sepChr m:val=""/>
-            <m:grow/>
-          </m:dPr>
-          <m:e>
-            <m:r>
-              <m:t>.22</m:t>
-            </m:r>
-            <m:r>
-              <m:rPr>
-                <m:sty m:val="p"/>
-              </m:rPr>
-              <m:t>,</m:t>
-            </m:r>
-            <m:r>
-              <m:t>.52</m:t>
-            </m:r>
-          </m:e>
-        </m:d>
-      </m:oMath>
-      <w:r>
-        <w:t xml:space="preserve">)</w:t>
+        <w:t xml:space="preserve">games.</w:t>
       </w:r>
     </w:p>
     <w:p>
@@ -5986,129 +5128,9 @@
       <w:r>
         <w:t xml:space="preserve">”</w:t>
       </w:r>
-      <w:r>
-        <w:t xml:space="preserve"> (br</w:t>
-      </w:r>
-      <w:r>
-        <w:t xml:space="preserve"> </w:t>
-      </w:r>
-      <m:oMath>
-        <m:r>
-          <m:rPr>
-            <m:sty m:val="p"/>
-          </m:rPr>
-          <m:t>∈</m:t>
-        </m:r>
-        <m:d>
-          <m:dPr>
-            <m:begChr m:val="["/>
-            <m:endChr m:val="]"/>
-            <m:sepChr m:val=""/>
-            <m:grow/>
-          </m:dPr>
-          <m:e>
-            <m:r>
-              <m:t>.02</m:t>
-            </m:r>
-            <m:r>
-              <m:rPr>
-                <m:sty m:val="p"/>
-              </m:rPr>
-              <m:t>,</m:t>
-            </m:r>
-            <m:r>
-              <m:t>.18</m:t>
-            </m:r>
-          </m:e>
-        </m:d>
-      </m:oMath>
-      <w:r>
-        <w:t xml:space="preserve"> </w:t>
-      </w:r>
-      <w:r>
-        <w:t xml:space="preserve">vbr</w:t>
-      </w:r>
-      <w:r>
-        <w:t xml:space="preserve"> </w:t>
-      </w:r>
-      <m:oMath>
-        <m:r>
-          <m:rPr>
-            <m:sty m:val="p"/>
-          </m:rPr>
-          <m:t>∈</m:t>
-        </m:r>
-        <m:d>
-          <m:dPr>
-            <m:begChr m:val="["/>
-            <m:endChr m:val="]"/>
-            <m:sepChr m:val=""/>
-            <m:grow/>
-          </m:dPr>
-          <m:e>
-            <m:r>
-              <m:t>.85</m:t>
-            </m:r>
-            <m:r>
-              <m:rPr>
-                <m:sty m:val="p"/>
-              </m:rPr>
-              <m:t>,</m:t>
-            </m:r>
-            <m:r>
-              <m:t>1.00</m:t>
-            </m:r>
-          </m:e>
-        </m:d>
-      </m:oMath>
-      <w:r>
-        <w:t xml:space="preserve"> </w:t>
-      </w:r>
-      <w:r>
-        <w:t xml:space="preserve">cr</w:t>
-      </w:r>
-      <w:r>
-        <w:t xml:space="preserve"> </w:t>
-      </w:r>
-      <m:oMath>
-        <m:r>
-          <m:rPr>
-            <m:sty m:val="p"/>
-          </m:rPr>
-          <m:t>∈</m:t>
-        </m:r>
-        <m:d>
-          <m:dPr>
-            <m:begChr m:val="["/>
-            <m:endChr m:val="]"/>
-            <m:sepChr m:val=""/>
-            <m:grow/>
-          </m:dPr>
-          <m:e>
-            <m:r>
-              <m:t>.25</m:t>
-            </m:r>
-            <m:r>
-              <m:rPr>
-                <m:sty m:val="p"/>
-              </m:rPr>
-              <m:t>,</m:t>
-            </m:r>
-            <m:r>
-              <m:t>.50</m:t>
-            </m:r>
-          </m:e>
-        </m:d>
-      </m:oMath>
-      <w:r>
-        <w:t xml:space="preserve"> </w:t>
-      </w:r>
-      <w:r>
-        <w:t xml:space="preserve"> (cooperative state))</w:t>
-      </w:r>
     </w:p>
-    <w:bookmarkEnd w:id="40"/>
-    <w:bookmarkStart w:id="41" w:name="categorical-posterior-over-types"/>
+    <w:bookmarkEnd w:id="34"/>
+    <w:bookmarkStart w:id="35" w:name="categorical-posterior-over-types"/>
     <w:p>
       <w:pPr>
         <w:pStyle w:val="Heading2"/>
@@ -7413,8 +6435,8 @@
         <w:t xml:space="preserve">This is a design choice, not a finding.</w:t>
       </w:r>
     </w:p>
-    <w:bookmarkEnd w:id="41"/>
-    <w:bookmarkStart w:id="42" w:name="four-agent-architectures"/>
+    <w:bookmarkEnd w:id="35"/>
+    <w:bookmarkStart w:id="36" w:name="four-agent-architectures"/>
     <w:p>
       <w:pPr>
         <w:pStyle w:val="Heading2"/>
@@ -7725,8 +6747,8 @@
         <w:t xml:space="preserve">number of hands hill climbers evaluate from 200 to fifty.</w:t>
       </w:r>
     </w:p>
-    <w:bookmarkEnd w:id="42"/>
-    <w:bookmarkStart w:id="43" w:name="experimental-design"/>
+    <w:bookmarkEnd w:id="36"/>
+    <w:bookmarkStart w:id="37" w:name="experimental-design"/>
     <w:p>
       <w:pPr>
         <w:pStyle w:val="Heading2"/>
@@ -7989,8 +7011,8 @@
         <w:t xml:space="preserve">Limitations.</w:t>
       </w:r>
     </w:p>
-    <w:bookmarkEnd w:id="43"/>
-    <w:bookmarkStart w:id="48" w:name="metrics"/>
+    <w:bookmarkEnd w:id="37"/>
+    <w:bookmarkStart w:id="42" w:name="metrics"/>
     <w:p>
       <w:pPr>
         <w:pStyle w:val="Heading2"/>
@@ -8145,7 +7167,7 @@
         <w:rPr>
           <w:rStyle w:val="FootnoteReference"/>
         </w:rPr>
-        <w:footnoteReference w:id="44"/>
+        <w:footnoteReference w:id="38"/>
       </w:r>
       <w:r>
         <w:t xml:space="preserve">,</w:t>
@@ -8160,7 +7182,7 @@
         <w:rPr>
           <w:rStyle w:val="FootnoteReference"/>
         </w:rPr>
-        <w:footnoteReference w:id="45"/>
+        <w:footnoteReference w:id="39"/>
       </w:r>
       <w:r>
         <w:t xml:space="preserve">, adaptation by the opponent</w:t>
@@ -8175,7 +7197,7 @@
         <w:rPr>
           <w:rStyle w:val="FootnoteReference"/>
         </w:rPr>
-        <w:footnoteReference w:id="46"/>
+        <w:footnoteReference w:id="40"/>
       </w:r>
       <w:r>
         <w:t xml:space="preserve">,</w:t>
@@ -8190,7 +7212,7 @@
         <w:rPr>
           <w:rStyle w:val="FootnoteReference"/>
         </w:rPr>
-        <w:footnoteReference w:id="47"/>
+        <w:footnoteReference w:id="41"/>
       </w:r>
       <w:r>
         <w:t xml:space="preserve">,</w:t>
@@ -9985,9 +9007,9 @@
         </w:tc>
       </w:tr>
     </w:tbl>
-    <w:bookmarkEnd w:id="48"/>
-    <w:bookmarkEnd w:id="49"/>
-    <w:bookmarkStart w:id="84" w:name="results"/>
+    <w:bookmarkEnd w:id="42"/>
+    <w:bookmarkEnd w:id="43"/>
+    <w:bookmarkStart w:id="78" w:name="results"/>
     <w:p>
       <w:pPr>
         <w:pStyle w:val="Heading1"/>
@@ -10199,7 +9221,7 @@
         <w:t xml:space="preserve">figures, and illustrative hands.</w:t>
       </w:r>
     </w:p>
-    <w:bookmarkStart w:id="57" w:name="phase-1-trust-as-a-liability"/>
+    <w:bookmarkStart w:id="51" w:name="phase-1-trust-as-a-liability"/>
     <w:p>
       <w:pPr>
         <w:pStyle w:val="Heading2"/>
@@ -10450,7 +9472,7 @@
         <w:rPr>
           <w:rStyle w:val="FootnoteReference"/>
         </w:rPr>
-        <w:footnoteReference w:id="50"/>
+        <w:footnoteReference w:id="44"/>
       </w:r>
       <w:r>
         <w:t xml:space="preserve">; its</w:t>
@@ -10516,18 +9538,18 @@
           <wp:inline>
             <wp:extent cx="5039999" cy="2200817"/>
             <wp:effectExtent b="0" l="0" r="0" t="0"/>
-            <wp:docPr descr="" title="" id="52" name="Picture"/>
+            <wp:docPr descr="" title="" id="46" name="Picture"/>
             <a:graphic>
               <a:graphicData uri="http://schemas.openxmlformats.org/drawingml/2006/picture">
                 <pic:pic>
                   <pic:nvPicPr>
-                    <pic:cNvPr descr="05_trust_vs_stack.png" id="53" name="Picture"/>
+                    <pic:cNvPr descr="05_trust_vs_stack.png" id="47" name="Picture"/>
                     <pic:cNvPicPr>
                       <a:picLocks noChangeArrowheads="1" noChangeAspect="1"/>
                     </pic:cNvPicPr>
                   </pic:nvPicPr>
                   <pic:blipFill>
-                    <a:blip r:embed="rId51"/>
+                    <a:blip r:embed="rId45"/>
                     <a:stretch>
                       <a:fillRect/>
                     </a:stretch>
@@ -10770,7 +9792,7 @@
         <w:rPr>
           <w:rStyle w:val="FootnoteReference"/>
         </w:rPr>
-        <w:footnoteReference w:id="54"/>
+        <w:footnoteReference w:id="48"/>
       </w:r>
       <w:r>
         <w:t xml:space="preserve"> </w:t>
@@ -10808,7 +9830,7 @@
         <w:rPr>
           <w:rStyle w:val="FootnoteReference"/>
         </w:rPr>
-        <w:footnoteReference w:id="55"/>
+        <w:footnoteReference w:id="49"/>
       </w:r>
       <w:r>
         <w:t xml:space="preserve"> </w:t>
@@ -12013,7 +11035,7 @@
         <w:t xml:space="preserve">being a wall.</w:t>
       </w:r>
     </w:p>
-    <w:bookmarkStart w:id="56" w:name="classification-accuracy."/>
+    <w:bookmarkStart w:id="50" w:name="classification-accuracy."/>
     <w:p>
       <w:pPr>
         <w:pStyle w:val="Heading4"/>
@@ -12447,9 +11469,9 @@
         <w:t xml:space="preserve">consequence of our design choice rather than an emergent finding.</w:t>
       </w:r>
     </w:p>
-    <w:bookmarkEnd w:id="56"/>
-    <w:bookmarkEnd w:id="57"/>
-    <w:bookmarkStart w:id="62" w:name="Xec1ea5c49c575925138d24a2fd331838a9be342"/>
+    <w:bookmarkEnd w:id="50"/>
+    <w:bookmarkEnd w:id="51"/>
+    <w:bookmarkStart w:id="56" w:name="Xec1ea5c49c575925138d24a2fd331838a9be342"/>
     <w:p>
       <w:pPr>
         <w:pStyle w:val="Heading2"/>
@@ -12869,7 +11891,7 @@
         <w:rPr>
           <w:rStyle w:val="FootnoteReference"/>
         </w:rPr>
-        <w:footnoteReference w:id="58"/>
+        <w:footnoteReference w:id="52"/>
       </w:r>
       <w:r>
         <w:t xml:space="preserve"> </w:t>
@@ -12946,18 +11968,18 @@
           <wp:inline>
             <wp:extent cx="5039999" cy="2014113"/>
             <wp:effectExtent b="0" l="0" r="0" t="0"/>
-            <wp:docPr descr="" title="" id="60" name="Picture"/>
+            <wp:docPr descr="" title="" id="54" name="Picture"/>
             <a:graphic>
               <a:graphicData uri="http://schemas.openxmlformats.org/drawingml/2006/picture">
                 <pic:pic>
                   <pic:nvPicPr>
-                    <pic:cNvPr descr="07_phase2_bounded_vs_unbounded_aggressive.png" id="61" name="Picture"/>
+                    <pic:cNvPr descr="07_phase2_bounded_vs_unbounded_aggressive.png" id="55" name="Picture"/>
                     <pic:cNvPicPr>
                       <a:picLocks noChangeArrowheads="1" noChangeAspect="1"/>
                     </pic:cNvPicPr>
                   </pic:nvPicPr>
                   <pic:blipFill>
-                    <a:blip r:embed="rId59"/>
+                    <a:blip r:embed="rId53"/>
                     <a:stretch>
                       <a:fillRect/>
                     </a:stretch>
@@ -13227,8 +12249,8 @@
         <w:t xml:space="preserve">nearly triples.</w:t>
       </w:r>
     </w:p>
-    <w:bookmarkEnd w:id="62"/>
-    <w:bookmarkStart w:id="69" w:name="Xd85fbd7dd2b27c73fdb4b678a47346e620fc769"/>
+    <w:bookmarkEnd w:id="56"/>
+    <w:bookmarkStart w:id="63" w:name="Xd85fbd7dd2b27c73fdb4b678a47346e620fc769"/>
     <w:p>
       <w:pPr>
         <w:pStyle w:val="Heading2"/>
@@ -13567,18 +12589,18 @@
           <wp:inline>
             <wp:extent cx="5039999" cy="1973691"/>
             <wp:effectExtent b="0" l="0" r="0" t="0"/>
-            <wp:docPr descr="" title="" id="64" name="Picture"/>
+            <wp:docPr descr="" title="" id="58" name="Picture"/>
             <a:graphic>
               <a:graphicData uri="http://schemas.openxmlformats.org/drawingml/2006/picture">
                 <pic:pic>
                   <pic:nvPicPr>
-                    <pic:cNvPr descr="14_nash_convergence_compare.png" id="65" name="Picture"/>
+                    <pic:cNvPr descr="14_nash_convergence_compare.png" id="59" name="Picture"/>
                     <pic:cNvPicPr>
                       <a:picLocks noChangeArrowheads="1" noChangeAspect="1"/>
                     </pic:cNvPicPr>
                   </pic:nvPicPr>
                   <pic:blipFill>
-                    <a:blip r:embed="rId63"/>
+                    <a:blip r:embed="rId57"/>
                     <a:stretch>
                       <a:fillRect/>
                     </a:stretch>
@@ -13918,18 +12940,18 @@
           <wp:inline>
             <wp:extent cx="5039999" cy="2357784"/>
             <wp:effectExtent b="0" l="0" r="0" t="0"/>
-            <wp:docPr descr="image" title="" id="67" name="Picture"/>
+            <wp:docPr descr="image" title="" id="61" name="Picture"/>
             <a:graphic>
               <a:graphicData uri="http://schemas.openxmlformats.org/drawingml/2006/picture">
                 <pic:pic>
                   <pic:nvPicPr>
-                    <pic:cNvPr descr="10_param_drift_unbounded_aggressive.png" id="68" name="Picture"/>
+                    <pic:cNvPr descr="10_param_drift_unbounded_aggressive.png" id="62" name="Picture"/>
                     <pic:cNvPicPr>
                       <a:picLocks noChangeArrowheads="1" noChangeAspect="1"/>
                     </pic:cNvPicPr>
                   </pic:nvPicPr>
                   <pic:blipFill>
-                    <a:blip r:embed="rId66"/>
+                    <a:blip r:embed="rId60"/>
                     <a:stretch>
                       <a:fillRect/>
                     </a:stretch>
@@ -14063,8 +13085,8 @@
         <w:t xml:space="preserve">dimensions—and we elaborate in the Discussion.</w:t>
       </w:r>
     </w:p>
-    <w:bookmarkEnd w:id="69"/>
-    <w:bookmarkStart w:id="74" w:name="X03031223673c1918fb804bd445ad961b80069e7"/>
+    <w:bookmarkEnd w:id="63"/>
+    <w:bookmarkStart w:id="68" w:name="X03031223673c1918fb804bd445ad961b80069e7"/>
     <w:p>
       <w:pPr>
         <w:pStyle w:val="Heading2"/>
@@ -14408,7 +13430,7 @@
         <w:rPr>
           <w:rStyle w:val="FootnoteReference"/>
         </w:rPr>
-        <w:footnoteReference w:id="70"/>
+        <w:footnoteReference w:id="64"/>
       </w:r>
       <w:r>
         <w:t xml:space="preserve">,</w:t>
@@ -14423,7 +13445,7 @@
         <w:rPr>
           <w:rStyle w:val="FootnoteReference"/>
         </w:rPr>
-        <w:footnoteReference w:id="71"/>
+        <w:footnoteReference w:id="65"/>
       </w:r>
       <w:r>
         <w:t xml:space="preserve">, and</w:t>
@@ -14438,7 +13460,7 @@
         <w:rPr>
           <w:rStyle w:val="FootnoteReference"/>
         </w:rPr>
-        <w:footnoteReference w:id="72"/>
+        <w:footnoteReference w:id="66"/>
       </w:r>
       <w:r>
         <w:t xml:space="preserve"> </w:t>
@@ -14498,7 +13520,7 @@
         <w:rPr>
           <w:rStyle w:val="FootnoteReference"/>
         </w:rPr>
-        <w:footnoteReference w:id="73"/>
+        <w:footnoteReference w:id="67"/>
       </w:r>
       <w:r>
         <w:t xml:space="preserve"> </w:t>
@@ -15421,8 +14443,8 @@
         <w:t xml:space="preserve">variability arising from sampling at temperature 1.0.</w:t>
       </w:r>
     </w:p>
-    <w:bookmarkEnd w:id="74"/>
-    <w:bookmarkStart w:id="83" w:name="X22234dbb09074be1d97998dd54a650fb012fcdd"/>
+    <w:bookmarkEnd w:id="68"/>
+    <w:bookmarkStart w:id="77" w:name="X22234dbb09074be1d97998dd54a650fb012fcdd"/>
     <w:p>
       <w:pPr>
         <w:pStyle w:val="Heading2"/>
@@ -15993,18 +15015,18 @@
           <wp:inline>
             <wp:extent cx="5039999" cy="3502485"/>
             <wp:effectExtent b="0" l="0" r="0" t="0"/>
-            <wp:docPr descr="" title="" id="76" name="Picture"/>
+            <wp:docPr descr="" title="" id="70" name="Picture"/>
             <a:graphic>
               <a:graphicData uri="http://schemas.openxmlformats.org/drawingml/2006/picture">
                 <pic:pic>
                   <pic:nvPicPr>
-                    <pic:cNvPr descr="03_economic_inversion.png" id="77" name="Picture"/>
+                    <pic:cNvPr descr="03_economic_inversion.png" id="71" name="Picture"/>
                     <pic:cNvPicPr>
                       <a:picLocks noChangeArrowheads="1" noChangeAspect="1"/>
                     </pic:cNvPicPr>
                   </pic:nvPicPr>
                   <pic:blipFill>
-                    <a:blip r:embed="rId75"/>
+                    <a:blip r:embed="rId69"/>
                     <a:stretch>
                       <a:fillRect/>
                     </a:stretch>
@@ -17486,18 +16508,18 @@
           <wp:inline>
             <wp:extent cx="5039999" cy="2905043"/>
             <wp:effectExtent b="0" l="0" r="0" t="0"/>
-            <wp:docPr descr="" title="" id="79" name="Picture"/>
+            <wp:docPr descr="" title="" id="73" name="Picture"/>
             <a:graphic>
               <a:graphicData uri="http://schemas.openxmlformats.org/drawingml/2006/picture">
                 <pic:pic>
                   <pic:nvPicPr>
-                    <pic:cNvPr descr="06_tma_by_archetype.png" id="80" name="Picture"/>
+                    <pic:cNvPr descr="06_tma_by_archetype.png" id="74" name="Picture"/>
                     <pic:cNvPicPr>
                       <a:picLocks noChangeArrowheads="1" noChangeAspect="1"/>
                     </pic:cNvPicPr>
                   </pic:nvPicPr>
                   <pic:blipFill>
-                    <a:blip r:embed="rId78"/>
+                    <a:blip r:embed="rId72"/>
                     <a:stretch>
                       <a:fillRect/>
                     </a:stretch>
@@ -18103,7 +17125,7 @@
         <w:rPr>
           <w:rStyle w:val="FootnoteReference"/>
         </w:rPr>
-        <w:footnoteReference w:id="81"/>
+        <w:footnoteReference w:id="75"/>
       </w:r>
       <w:r>
         <w:t xml:space="preserve"> </w:t>
@@ -18141,7 +17163,7 @@
         <w:rPr>
           <w:rStyle w:val="FootnoteReference"/>
         </w:rPr>
-        <w:footnoteReference w:id="82"/>
+        <w:footnoteReference w:id="76"/>
       </w:r>
       <w:r>
         <w:t xml:space="preserve">, places</w:t>
@@ -19426,9 +18448,9 @@
         <w:t xml:space="preserve">notes, does.</w:t>
       </w:r>
     </w:p>
-    <w:bookmarkEnd w:id="83"/>
-    <w:bookmarkEnd w:id="84"/>
-    <w:bookmarkStart w:id="89" w:name="discussion"/>
+    <w:bookmarkEnd w:id="77"/>
+    <w:bookmarkEnd w:id="78"/>
+    <w:bookmarkStart w:id="83" w:name="discussion"/>
     <w:p>
       <w:pPr>
         <w:pStyle w:val="Heading1"/>
@@ -19496,7 +18518,7 @@
         <w:t xml:space="preserve">five-seed study.</w:t>
       </w:r>
     </w:p>
-    <w:bookmarkStart w:id="85" w:name="the-mechanism-behind-the-trap"/>
+    <w:bookmarkStart w:id="79" w:name="the-mechanism-behind-the-trap"/>
     <w:p>
       <w:pPr>
         <w:pStyle w:val="Heading2"/>
@@ -19799,8 +18821,8 @@
         <w:t xml:space="preserve">the IPD literature.</w:t>
       </w:r>
     </w:p>
-    <w:bookmarkEnd w:id="85"/>
-    <w:bookmarkStart w:id="86" w:name="X9e6c40cad178285c35ddd5d7c7f81b9cea92775"/>
+    <w:bookmarkEnd w:id="79"/>
+    <w:bookmarkStart w:id="80" w:name="X9e6c40cad178285c35ddd5d7c7f81b9cea92775"/>
     <w:p>
       <w:pPr>
         <w:pStyle w:val="Heading2"/>
@@ -20691,8 +19713,8 @@
         <w:t xml:space="preserve">structural change in agent behavior.</w:t>
       </w:r>
     </w:p>
-    <w:bookmarkEnd w:id="86"/>
-    <w:bookmarkStart w:id="87" w:name="Xb960717fc3de66c66b8f59820377ad2ce658cf8"/>
+    <w:bookmarkEnd w:id="80"/>
+    <w:bookmarkStart w:id="81" w:name="Xb960717fc3de66c66b8f59820377ad2ce658cf8"/>
     <w:p>
       <w:pPr>
         <w:pStyle w:val="Heading2"/>
@@ -21075,8 +20097,8 @@
         <w:t xml:space="preserve">to claim more than analogical inference.</w:t>
       </w:r>
     </w:p>
-    <w:bookmarkEnd w:id="87"/>
-    <w:bookmarkStart w:id="88" w:name="limitations"/>
+    <w:bookmarkEnd w:id="81"/>
+    <w:bookmarkStart w:id="82" w:name="limitations"/>
     <w:p>
       <w:pPr>
         <w:pStyle w:val="Heading2"/>
@@ -21870,9 +20892,9 @@
         <w:t xml:space="preserve">warranted.</w:t>
       </w:r>
     </w:p>
-    <w:bookmarkEnd w:id="88"/>
-    <w:bookmarkEnd w:id="89"/>
-    <w:bookmarkStart w:id="90" w:name="conclusion"/>
+    <w:bookmarkEnd w:id="82"/>
+    <w:bookmarkEnd w:id="83"/>
+    <w:bookmarkStart w:id="84" w:name="conclusion"/>
     <w:p>
       <w:pPr>
         <w:pStyle w:val="Heading1"/>
@@ -22431,8 +21453,8 @@
         <w:t xml:space="preserve">would each strengthen the present findings.</w:t>
       </w:r>
     </w:p>
-    <w:bookmarkEnd w:id="90"/>
-    <w:bookmarkStart w:id="112" w:name="sources-and-acknowledgments"/>
+    <w:bookmarkEnd w:id="84"/>
+    <w:bookmarkStart w:id="106" w:name="sources-and-acknowledgments"/>
     <w:p>
       <w:pPr>
         <w:pStyle w:val="Heading1"/>
@@ -22441,7 +21463,7 @@
         <w:t xml:space="preserve">Sources and Acknowledgments</w:t>
       </w:r>
     </w:p>
-    <w:bookmarkStart w:id="96" w:name="acknowledgments"/>
+    <w:bookmarkStart w:id="90" w:name="acknowledgments"/>
     <w:p>
       <w:pPr>
         <w:pStyle w:val="Heading2"/>
@@ -22464,7 +21486,7 @@
         <w:t xml:space="preserve">feasible.</w:t>
       </w:r>
     </w:p>
-    <w:bookmarkStart w:id="91" w:name="funding."/>
+    <w:bookmarkStart w:id="85" w:name="funding."/>
     <w:p>
       <w:pPr>
         <w:pStyle w:val="Heading4"/>
@@ -22487,8 +21509,8 @@
         <w:t xml:space="preserve">the author.</w:t>
       </w:r>
     </w:p>
-    <w:bookmarkEnd w:id="91"/>
-    <w:bookmarkStart w:id="92" w:name="author-contributions."/>
+    <w:bookmarkEnd w:id="85"/>
+    <w:bookmarkStart w:id="86" w:name="author-contributions."/>
     <w:p>
       <w:pPr>
         <w:pStyle w:val="Heading4"/>
@@ -22517,8 +21539,8 @@
         <w:t xml:space="preserve">manuscript.</w:t>
       </w:r>
     </w:p>
-    <w:bookmarkEnd w:id="92"/>
-    <w:bookmarkStart w:id="93" w:name="competing-interests."/>
+    <w:bookmarkEnd w:id="86"/>
+    <w:bookmarkStart w:id="87" w:name="competing-interests."/>
     <w:p>
       <w:pPr>
         <w:pStyle w:val="Heading4"/>
@@ -22541,8 +21563,8 @@
         <w:t xml:space="preserve">interests.</w:t>
       </w:r>
     </w:p>
-    <w:bookmarkEnd w:id="93"/>
-    <w:bookmarkStart w:id="95" w:name="data-and-materials-availability."/>
+    <w:bookmarkEnd w:id="87"/>
+    <w:bookmarkStart w:id="89" w:name="data-and-materials-availability."/>
     <w:p>
       <w:pPr>
         <w:pStyle w:val="Heading4"/>
@@ -22567,7 +21589,7 @@
       <w:r>
         <w:t xml:space="preserve"> </w:t>
       </w:r>
-      <w:hyperlink r:id="rId94">
+      <w:hyperlink r:id="rId88">
         <w:r>
           <w:rPr>
             <w:rStyle w:val="Hyperlink"/>
@@ -22579,9 +21601,9 @@
         <w:t xml:space="preserve">.</w:t>
       </w:r>
     </w:p>
-    <w:bookmarkEnd w:id="95"/>
-    <w:bookmarkEnd w:id="96"/>
-    <w:bookmarkStart w:id="97" w:name="references"/>
+    <w:bookmarkEnd w:id="89"/>
+    <w:bookmarkEnd w:id="90"/>
+    <w:bookmarkStart w:id="91" w:name="references"/>
     <w:p>
       <w:pPr>
         <w:pStyle w:val="Heading2"/>
@@ -22590,8 +21612,8 @@
         <w:t xml:space="preserve">References</w:t>
       </w:r>
     </w:p>
-    <w:bookmarkEnd w:id="97"/>
-    <w:bookmarkStart w:id="111" w:name="supplementary-materials"/>
+    <w:bookmarkEnd w:id="91"/>
+    <w:bookmarkStart w:id="105" w:name="supplementary-materials"/>
     <w:p>
       <w:pPr>
         <w:pStyle w:val="Heading2"/>
@@ -22704,8 +21726,8 @@
         <w:br/>
       </w:r>
     </w:p>
-    <w:bookmarkStart w:id="110" w:name="refs"/>
-    <w:bookmarkStart w:id="98" w:name="ref-resnick2002trust"/>
+    <w:bookmarkStart w:id="104" w:name="refs"/>
+    <w:bookmarkStart w:id="92" w:name="ref-resnick2002trust"/>
     <w:p>
       <w:pPr>
         <w:pStyle w:val="Bibliography"/>
@@ -22760,8 +21782,8 @@
         <w:t xml:space="preserve">, vol. 11, pp. 127–157, 2002.</w:t>
       </w:r>
     </w:p>
-    <w:bookmarkEnd w:id="98"/>
-    <w:bookmarkStart w:id="99" w:name="ref-bolton2004effective"/>
+    <w:bookmarkEnd w:id="92"/>
+    <w:bookmarkStart w:id="93" w:name="ref-bolton2004effective"/>
     <w:p>
       <w:pPr>
         <w:pStyle w:val="Bibliography"/>
@@ -22807,8 +21829,8 @@
         <w:t xml:space="preserve">, vol. 50, no. 11, pp. 1587–1602, 2004.</w:t>
       </w:r>
     </w:p>
-    <w:bookmarkEnd w:id="99"/>
-    <w:bookmarkStart w:id="100" w:name="ref-glosten1985bid"/>
+    <w:bookmarkEnd w:id="93"/>
+    <w:bookmarkStart w:id="94" w:name="ref-glosten1985bid"/>
     <w:p>
       <w:pPr>
         <w:pStyle w:val="Bibliography"/>
@@ -22845,8 +21867,8 @@
         <w:t xml:space="preserve">, vol. 14, no. 1, pp. 71–100, 1985.</w:t>
       </w:r>
     </w:p>
-    <w:bookmarkEnd w:id="100"/>
-    <w:bookmarkStart w:id="101" w:name="ref-axelrod1984evolution"/>
+    <w:bookmarkEnd w:id="94"/>
+    <w:bookmarkStart w:id="95" w:name="ref-axelrod1984evolution"/>
     <w:p>
       <w:pPr>
         <w:pStyle w:val="Bibliography"/>
@@ -22877,8 +21899,8 @@
         <w:t xml:space="preserve">. Basic Books, 1984.</w:t>
       </w:r>
     </w:p>
-    <w:bookmarkEnd w:id="101"/>
-    <w:bookmarkStart w:id="102" w:name="ref-nowak2006five"/>
+    <w:bookmarkEnd w:id="95"/>
+    <w:bookmarkStart w:id="96" w:name="ref-nowak2006five"/>
     <w:p>
       <w:pPr>
         <w:pStyle w:val="Bibliography"/>
@@ -22915,8 +21937,8 @@
         <w:t xml:space="preserve">, vol. 314, no. 5805, pp. 1560–1563, 2006.</w:t>
       </w:r>
     </w:p>
-    <w:bookmarkEnd w:id="102"/>
-    <w:bookmarkStart w:id="103" w:name="ref-billings1998opponent"/>
+    <w:bookmarkEnd w:id="96"/>
+    <w:bookmarkStart w:id="97" w:name="ref-billings1998opponent"/>
     <w:p>
       <w:pPr>
         <w:pStyle w:val="Bibliography"/>
@@ -22959,8 +21981,8 @@
         <w:t xml:space="preserve">, 1998, pp. 493–499.</w:t>
       </w:r>
     </w:p>
-    <w:bookmarkEnd w:id="103"/>
-    <w:bookmarkStart w:id="104" w:name="ref-southey2005bayes"/>
+    <w:bookmarkEnd w:id="97"/>
+    <w:bookmarkStart w:id="98" w:name="ref-southey2005bayes"/>
     <w:p>
       <w:pPr>
         <w:pStyle w:val="Bibliography"/>
@@ -23022,8 +22044,8 @@
         <w:t xml:space="preserve">, 2005, pp. 550–558.</w:t>
       </w:r>
     </w:p>
-    <w:bookmarkEnd w:id="104"/>
-    <w:bookmarkStart w:id="105" w:name="ref-ganzfried2015safe"/>
+    <w:bookmarkEnd w:id="98"/>
+    <w:bookmarkStart w:id="99" w:name="ref-ganzfried2015safe"/>
     <w:p>
       <w:pPr>
         <w:pStyle w:val="Bibliography"/>
@@ -23060,8 +22082,8 @@
         <w:t xml:space="preserve">, vol. 3, no. 2, pp. 8:1–8:28, 2015.</w:t>
       </w:r>
     </w:p>
-    <w:bookmarkEnd w:id="105"/>
-    <w:bookmarkStart w:id="106" w:name="ref-brown2018superhuman"/>
+    <w:bookmarkEnd w:id="99"/>
+    <w:bookmarkStart w:id="100" w:name="ref-brown2018superhuman"/>
     <w:p>
       <w:pPr>
         <w:pStyle w:val="Bibliography"/>
@@ -23119,8 +22141,8 @@
         <w:t xml:space="preserve">, vol. 359, no. 6374, pp. 418–424, 2018.</w:t>
       </w:r>
     </w:p>
-    <w:bookmarkEnd w:id="106"/>
-    <w:bookmarkStart w:id="107" w:name="ref-brown2019superhuman"/>
+    <w:bookmarkEnd w:id="100"/>
+    <w:bookmarkStart w:id="101" w:name="ref-brown2019superhuman"/>
     <w:p>
       <w:pPr>
         <w:pStyle w:val="Bibliography"/>
@@ -23169,8 +22191,8 @@
         <w:t xml:space="preserve">, vol. 365, no. 6456, pp. 885–890, 2019.</w:t>
       </w:r>
     </w:p>
-    <w:bookmarkEnd w:id="107"/>
-    <w:bookmarkStart w:id="108" w:name="ref-liu2024agentbench"/>
+    <w:bookmarkEnd w:id="101"/>
+    <w:bookmarkStart w:id="102" w:name="ref-liu2024agentbench"/>
     <w:p>
       <w:pPr>
         <w:pStyle w:val="Bibliography"/>
@@ -23247,8 +22269,8 @@
         <w:t xml:space="preserve">, 2024.</w:t>
       </w:r>
     </w:p>
-    <w:bookmarkEnd w:id="108"/>
-    <w:bookmarkStart w:id="109" w:name="ref-park2023generative"/>
+    <w:bookmarkEnd w:id="102"/>
+    <w:bookmarkStart w:id="103" w:name="ref-park2023generative"/>
     <w:p>
       <w:pPr>
         <w:pStyle w:val="Bibliography"/>
@@ -23319,10 +22341,10 @@
         <w:t xml:space="preserve">, 2023.</w:t>
       </w:r>
     </w:p>
-    <w:bookmarkEnd w:id="109"/>
-    <w:bookmarkEnd w:id="110"/>
-    <w:bookmarkEnd w:id="111"/>
-    <w:bookmarkEnd w:id="112"/>
+    <w:bookmarkEnd w:id="103"/>
+    <w:bookmarkEnd w:id="104"/>
+    <w:bookmarkEnd w:id="105"/>
+    <w:bookmarkEnd w:id="106"/>
     <w:sectPr>
       <w:headerReference w:type="default" r:id="rId9"/>
       <w:footerReference w:type="default" r:id="rId10"/>
@@ -23394,101 +22416,6 @@
         <w:t xml:space="preserve"> </w:t>
       </w:r>
       <w:r>
-        <w:t xml:space="preserve">The two private cards</w:t>
-      </w:r>
-      <w:r>
-        <w:t xml:space="preserve"> </w:t>
-      </w:r>
-      <w:r>
-        <w:t xml:space="preserve">each player is dealt at the start of every hand; only the player</w:t>
-      </w:r>
-      <w:r>
-        <w:t xml:space="preserve"> </w:t>
-      </w:r>
-      <w:r>
-        <w:t xml:space="preserve">can see them.</w:t>
-      </w:r>
-    </w:p>
-  </w:footnote>
-  <w:footnote w:id="21">
-    <w:p>
-      <w:pPr>
-        <w:pStyle w:val="FootnoteText"/>
-      </w:pPr>
-      <w:r>
-        <w:rPr>
-          <w:rStyle w:val="FootnoteReference"/>
-        </w:rPr>
-        <w:footnoteRef/>
-      </w:r>
-      <w:r>
-        <w:t xml:space="preserve"> </w:t>
-      </w:r>
-      <w:r>
-        <w:t xml:space="preserve">Limit Texas Hold’em fixes the bet size on each</w:t>
-      </w:r>
-      <w:r>
-        <w:t xml:space="preserve"> </w:t>
-      </w:r>
-      <w:r>
-        <w:t xml:space="preserve">round. In our setup, bets and raises on the first two rounds are</w:t>
-      </w:r>
-      <w:r>
-        <w:t xml:space="preserve"> </w:t>
-      </w:r>
-      <w:r>
-        <w:t xml:space="preserve">2 chips; on the last two rounds they are 4 chips. No player can</w:t>
-      </w:r>
-      <w:r>
-        <w:t xml:space="preserve"> </w:t>
-      </w:r>
-      <w:r>
-        <w:t xml:space="preserve">place more than four bets in a single round (the</w:t>
-      </w:r>
-      <w:r>
-        <w:t xml:space="preserve"> </w:t>
-      </w:r>
-      <w:r>
-        <w:t xml:space="preserve">“</w:t>
-      </w:r>
-      <w:r>
-        <w:t xml:space="preserve">four-bet</w:t>
-      </w:r>
-      <w:r>
-        <w:t xml:space="preserve"> </w:t>
-      </w:r>
-      <w:r>
-        <w:t xml:space="preserve">cap</w:t>
-      </w:r>
-      <w:r>
-        <w:t xml:space="preserve">”</w:t>
-      </w:r>
-      <w:r>
-        <w:t xml:space="preserve">), which keeps the action space small and the math</w:t>
-      </w:r>
-      <w:r>
-        <w:t xml:space="preserve"> </w:t>
-      </w:r>
-      <w:r>
-        <w:t xml:space="preserve">tractable.</w:t>
-      </w:r>
-    </w:p>
-  </w:footnote>
-  <w:footnote w:id="22">
-    <w:p>
-      <w:pPr>
-        <w:pStyle w:val="FootnoteText"/>
-      </w:pPr>
-      <w:r>
-        <w:rPr>
-          <w:rStyle w:val="FootnoteReference"/>
-        </w:rPr>
-        <w:footnoteRef/>
-      </w:r>
-      <w:r>
-        <w:t xml:space="preserve"> </w:t>
-      </w:r>
-      <w:r>
         <w:t xml:space="preserve">The Pearson correlation coefficient measures</w:t>
       </w:r>
       <w:r>
@@ -23607,7 +22534,7 @@
       </w:r>
     </w:p>
   </w:footnote>
-  <w:footnote w:id="28">
+  <w:footnote w:id="26">
     <w:p>
       <w:pPr>
         <w:pStyle w:val="FootnoteText"/>
@@ -23689,7 +22616,7 @@
       </w:r>
     </w:p>
   </w:footnote>
-  <w:footnote w:id="34">
+  <w:footnote w:id="32">
     <w:p>
       <w:pPr>
         <w:pStyle w:val="FootnoteText"/>
@@ -23704,13 +22631,13 @@
         <w:t xml:space="preserve"> </w:t>
       </w:r>
       <w:r>
-        <w:t xml:space="preserve">The four betting rounds in Texas Hold’em, in</w:t>
-      </w:r>
-      <w:r>
-        <w:t xml:space="preserve"> </w:t>
-      </w:r>
-      <w:r>
-        <w:t xml:space="preserve">order, are</w:t>
+        <w:t xml:space="preserve">When a player goes all-in for fewer chips than the</w:t>
+      </w:r>
+      <w:r>
+        <w:t xml:space="preserve"> </w:t>
+      </w:r>
+      <w:r>
+        <w:t xml:space="preserve">largest contributor, the engine creates a</w:t>
       </w:r>
       <w:r>
         <w:t xml:space="preserve"> </w:t>
@@ -23720,95 +22647,35 @@
           <w:iCs/>
           <w:i/>
         </w:rPr>
-        <w:t xml:space="preserve">preflop</w:t>
-      </w:r>
-      <w:r>
-        <w:t xml:space="preserve"> </w:t>
-      </w:r>
-      <w:r>
-        <w:t xml:space="preserve">(after each player receives two private</w:t>
-      </w:r>
-      <w:r>
-        <w:t xml:space="preserve"> </w:t>
-      </w:r>
-      <w:r>
-        <w:t xml:space="preserve">“</w:t>
-      </w:r>
-      <w:r>
-        <w:t xml:space="preserve">hole</w:t>
-      </w:r>
-      <w:r>
-        <w:t xml:space="preserve">”</w:t>
-      </w:r>
-      <w:r>
-        <w:t xml:space="preserve"> </w:t>
-      </w:r>
-      <w:r>
-        <w:t xml:space="preserve">cards but before any community cards),</w:t>
-      </w:r>
-      <w:r>
-        <w:t xml:space="preserve"> </w:t>
-      </w:r>
-      <w:r>
-        <w:rPr>
-          <w:iCs/>
-          <w:i/>
-        </w:rPr>
-        <w:t xml:space="preserve">flop</w:t>
-      </w:r>
-      <w:r>
-        <w:t xml:space="preserve"> </w:t>
-      </w:r>
-      <w:r>
-        <w:t xml:space="preserve">(after</w:t>
-      </w:r>
-      <w:r>
-        <w:t xml:space="preserve"> </w:t>
-      </w:r>
-      <w:r>
-        <w:t xml:space="preserve">three community cards are dealt simultaneously),</w:t>
-      </w:r>
-      <w:r>
-        <w:t xml:space="preserve"> </w:t>
-      </w:r>
-      <w:r>
-        <w:rPr>
-          <w:iCs/>
-          <w:i/>
-        </w:rPr>
-        <w:t xml:space="preserve">turn</w:t>
-      </w:r>
-      <w:r>
-        <w:t xml:space="preserve"> </w:t>
-      </w:r>
-      <w:r>
-        <w:t xml:space="preserve">(after a fourth community card), and</w:t>
-      </w:r>
-      <w:r>
-        <w:t xml:space="preserve"> </w:t>
-      </w:r>
-      <w:r>
-        <w:rPr>
-          <w:iCs/>
-          <w:i/>
-        </w:rPr>
-        <w:t xml:space="preserve">river</w:t>
-      </w:r>
-      <w:r>
-        <w:t xml:space="preserve"> </w:t>
-      </w:r>
-      <w:r>
-        <w:t xml:space="preserve">(after a fifth</w:t>
-      </w:r>
-      <w:r>
-        <w:t xml:space="preserve"> </w:t>
-      </w:r>
-      <w:r>
-        <w:t xml:space="preserve">and final community card).</w:t>
+        <w:t xml:space="preserve">side pot</w:t>
+      </w:r>
+      <w:r>
+        <w:t xml:space="preserve"> </w:t>
+      </w:r>
+      <w:r>
+        <w:t xml:space="preserve">for the</w:t>
+      </w:r>
+      <w:r>
+        <w:t xml:space="preserve"> </w:t>
+      </w:r>
+      <w:r>
+        <w:t xml:space="preserve">excess so that the short-stacked player can only win up to the</w:t>
+      </w:r>
+      <w:r>
+        <w:t xml:space="preserve"> </w:t>
+      </w:r>
+      <w:r>
+        <w:t xml:space="preserve">amount they contributed; deeper-stacked players contest the</w:t>
+      </w:r>
+      <w:r>
+        <w:t xml:space="preserve"> </w:t>
+      </w:r>
+      <w:r>
+        <w:t xml:space="preserve">remainder among themselves.</w:t>
       </w:r>
     </w:p>
   </w:footnote>
-  <w:footnote w:id="35">
+  <w:footnote w:id="38">
     <w:p>
       <w:pPr>
         <w:pStyle w:val="FootnoteText"/>
@@ -23823,131 +22690,29 @@
         <w:t xml:space="preserve"> </w:t>
       </w:r>
       <w:r>
-        <w:t xml:space="preserve">Fixed-limit Texas</w:t>
-      </w:r>
-      <w:r>
-        <w:t xml:space="preserve"> </w:t>
-      </w:r>
-      <w:r>
-        <w:t xml:space="preserve">Hold’em permits at most four raises per betting round; further</w:t>
-      </w:r>
-      <w:r>
-        <w:t xml:space="preserve"> </w:t>
-      </w:r>
-      <w:r>
-        <w:t xml:space="preserve">raises are not allowed.</w:t>
-      </w:r>
-    </w:p>
-  </w:footnote>
-  <w:footnote w:id="36">
-    <w:p>
-      <w:pPr>
-        <w:pStyle w:val="FootnoteText"/>
-      </w:pPr>
-      <w:r>
-        <w:rPr>
-          <w:rStyle w:val="FootnoteReference"/>
-        </w:rPr>
-        <w:footnoteRef/>
-      </w:r>
-      <w:r>
-        <w:t xml:space="preserve"> </w:t>
-      </w:r>
-      <w:r>
-        <w:t xml:space="preserve">When a player goes all-in for fewer chips than the</w:t>
-      </w:r>
-      <w:r>
-        <w:t xml:space="preserve"> </w:t>
-      </w:r>
-      <w:r>
-        <w:t xml:space="preserve">largest contributor, the engine creates a</w:t>
-      </w:r>
-      <w:r>
-        <w:t xml:space="preserve"> </w:t>
-      </w:r>
-      <w:r>
         <w:rPr>
           <w:iCs/>
           <w:i/>
         </w:rPr>
-        <w:t xml:space="preserve">side pot</w:t>
-      </w:r>
-      <w:r>
-        <w:t xml:space="preserve"> </w:t>
-      </w:r>
-      <w:r>
-        <w:t xml:space="preserve">for the</w:t>
-      </w:r>
-      <w:r>
-        <w:t xml:space="preserve"> </w:t>
-      </w:r>
-      <w:r>
-        <w:t xml:space="preserve">excess so that the short-stacked player can only win up to the</w:t>
-      </w:r>
-      <w:r>
-        <w:t xml:space="preserve"> </w:t>
-      </w:r>
-      <w:r>
-        <w:t xml:space="preserve">amount they contributed; deeper-stacked players contest the</w:t>
-      </w:r>
-      <w:r>
-        <w:t xml:space="preserve"> </w:t>
-      </w:r>
-      <w:r>
-        <w:t xml:space="preserve">remainder among themselves.</w:t>
-      </w:r>
-    </w:p>
-  </w:footnote>
-  <w:footnote w:id="37">
-    <w:p>
-      <w:pPr>
-        <w:pStyle w:val="FootnoteText"/>
-      </w:pPr>
-      <w:r>
-        <w:rPr>
-          <w:rStyle w:val="FootnoteReference"/>
-        </w:rPr>
-        <w:footnoteRef/>
-      </w:r>
-      <w:r>
-        <w:t xml:space="preserve"> </w:t>
-      </w:r>
-      <w:r>
-        <w:t xml:space="preserve">A</w:t>
-      </w:r>
-      <w:r>
-        <w:t xml:space="preserve"> </w:t>
-      </w:r>
-      <w:r>
-        <w:rPr>
-          <w:iCs/>
-          <w:i/>
-        </w:rPr>
-        <w:t xml:space="preserve">showdown</w:t>
-      </w:r>
-      <w:r>
-        <w:t xml:space="preserve"> </w:t>
-      </w:r>
-      <w:r>
-        <w:t xml:space="preserve">is the end-of-hand reveal in</w:t>
-      </w:r>
-      <w:r>
-        <w:t xml:space="preserve"> </w:t>
-      </w:r>
-      <w:r>
-        <w:t xml:space="preserve">which all still-active players turn over their hole cards to</w:t>
-      </w:r>
-      <w:r>
-        <w:t xml:space="preserve"> </w:t>
-      </w:r>
-      <w:r>
-        <w:t xml:space="preserve">determine the winner; pots that end with all opponents folding to a</w:t>
-      </w:r>
-      <w:r>
-        <w:t xml:space="preserve"> </w:t>
-      </w:r>
-      <w:r>
-        <w:t xml:space="preserve">single player do not reach showdown.</w:t>
+        <w:t xml:space="preserve">TEI</w:t>
+      </w:r>
+      <w:r>
+        <w:t xml:space="preserve"> </w:t>
+      </w:r>
+      <w:r>
+        <w:t xml:space="preserve">(Trust</w:t>
+      </w:r>
+      <w:r>
+        <w:t xml:space="preserve"> </w:t>
+      </w:r>
+      <w:r>
+        <w:t xml:space="preserve">Exploitation Index) is an agent’s mean non-showdown profit per</w:t>
+      </w:r>
+      <w:r>
+        <w:t xml:space="preserve"> </w:t>
+      </w:r>
+      <w:r>
+        <w:t xml:space="preserve">hand—value won through fold equity rather than at showdown.</w:t>
       </w:r>
     </w:p>
   </w:footnote>
@@ -23966,35 +22731,42 @@
         <w:t xml:space="preserve"> </w:t>
       </w:r>
       <w:r>
-        <w:t xml:space="preserve">Throughout the archetype</w:t>
-      </w:r>
-      <w:r>
-        <w:t xml:space="preserve"> </w:t>
-      </w:r>
-      <w:r>
-        <w:t xml:space="preserve">descriptions,</w:t>
-      </w:r>
-      <w:r>
-        <w:t xml:space="preserve"> </w:t>
-      </w:r>
-      <w:r>
         <w:rPr>
           <w:iCs/>
           <w:i/>
         </w:rPr>
-        <w:t xml:space="preserve">br</w:t>
-      </w:r>
-      <w:r>
-        <w:t xml:space="preserve"> </w:t>
-      </w:r>
-      <w:r>
-        <w:t xml:space="preserve">= bluff rate (probability of betting on a</w:t>
-      </w:r>
-      <w:r>
-        <w:t xml:space="preserve"> </w:t>
-      </w:r>
-      <w:r>
-        <w:t xml:space="preserve">weak hand),</w:t>
+        <w:t xml:space="preserve">CS</w:t>
+      </w:r>
+      <w:r>
+        <w:t xml:space="preserve"> </w:t>
+      </w:r>
+      <w:r>
+        <w:t xml:space="preserve">(Context</w:t>
+      </w:r>
+      <w:r>
+        <w:t xml:space="preserve"> </w:t>
+      </w:r>
+      <w:r>
+        <w:t xml:space="preserve">Sensitivity) is the absolute correlation between an opponent’s recent</w:t>
+      </w:r>
+      <w:r>
+        <w:t xml:space="preserve"> </w:t>
+      </w:r>
+      <w:r>
+        <w:t xml:space="preserve">aggression and the agent’s own action.</w:t>
+      </w:r>
+    </w:p>
+  </w:footnote>
+  <w:footnote w:id="40">
+    <w:p>
+      <w:pPr>
+        <w:pStyle w:val="FootnoteText"/>
+      </w:pPr>
+      <w:r>
+        <w:rPr>
+          <w:rStyle w:val="FootnoteReference"/>
+        </w:rPr>
+        <w:footnoteRef/>
       </w:r>
       <w:r>
         <w:t xml:space="preserve"> </w:t>
@@ -24004,19 +22776,32 @@
           <w:iCs/>
           <w:i/>
         </w:rPr>
-        <w:t xml:space="preserve">vbr</w:t>
-      </w:r>
-      <w:r>
-        <w:t xml:space="preserve"> </w:t>
-      </w:r>
-      <w:r>
-        <w:t xml:space="preserve">= value-bet rate (probability of betting on</w:t>
-      </w:r>
-      <w:r>
-        <w:t xml:space="preserve"> </w:t>
-      </w:r>
-      <w:r>
-        <w:t xml:space="preserve">a strong hand), and</w:t>
+        <w:t xml:space="preserve">OA</w:t>
+      </w:r>
+      <w:r>
+        <w:t xml:space="preserve"> </w:t>
+      </w:r>
+      <w:r>
+        <w:t xml:space="preserve">(Opponent Adaptation) is the variance of</w:t>
+      </w:r>
+      <w:r>
+        <w:t xml:space="preserve"> </w:t>
+      </w:r>
+      <w:r>
+        <w:t xml:space="preserve">an agent’s aggression rate across different opponents.</w:t>
+      </w:r>
+    </w:p>
+  </w:footnote>
+  <w:footnote w:id="41">
+    <w:p>
+      <w:pPr>
+        <w:pStyle w:val="FootnoteText"/>
+      </w:pPr>
+      <w:r>
+        <w:rPr>
+          <w:rStyle w:val="FootnoteReference"/>
+        </w:rPr>
+        <w:footnoteRef/>
       </w:r>
       <w:r>
         <w:t xml:space="preserve"> </w:t>
@@ -24026,25 +22811,25 @@
           <w:iCs/>
           <w:i/>
         </w:rPr>
-        <w:t xml:space="preserve">cr</w:t>
-      </w:r>
-      <w:r>
-        <w:t xml:space="preserve"> </w:t>
-      </w:r>
-      <w:r>
-        <w:t xml:space="preserve">= call rate facing a bet on a medium</w:t>
-      </w:r>
-      <w:r>
-        <w:t xml:space="preserve"> </w:t>
-      </w:r>
-      <w:r>
-        <w:t xml:space="preserve">hand. Ranges are the archetype’s Phase 2 hill-climbing bound boxes</w:t>
-      </w:r>
-      <w:r>
-        <w:t xml:space="preserve"> </w:t>
-      </w:r>
-      <w:r>
-        <w:t xml:space="preserve">around its Phase 1 starting parameters.</w:t>
+        <w:t xml:space="preserve">NS</w:t>
+      </w:r>
+      <w:r>
+        <w:t xml:space="preserve"> </w:t>
+      </w:r>
+      <w:r>
+        <w:t xml:space="preserve">(Non-Stationarity)</w:t>
+      </w:r>
+      <w:r>
+        <w:t xml:space="preserve"> </w:t>
+      </w:r>
+      <w:r>
+        <w:t xml:space="preserve">gauges how much an agent’s action distribution drifts over the run,</w:t>
+      </w:r>
+      <w:r>
+        <w:t xml:space="preserve"> </w:t>
+      </w:r>
+      <w:r>
+        <w:t xml:space="preserve">comparing 500-hand windows against its overall distribution.</w:t>
       </w:r>
     </w:p>
   </w:footnote>
@@ -24063,33 +22848,60 @@
         <w:t xml:space="preserve"> </w:t>
       </w:r>
       <w:r>
+        <w:t xml:space="preserve">A</w:t>
+      </w:r>
+      <w:r>
+        <w:t xml:space="preserve"> </w:t>
+      </w:r>
+      <w:r>
         <w:rPr>
           <w:iCs/>
           <w:i/>
         </w:rPr>
-        <w:t xml:space="preserve">TEI</w:t>
-      </w:r>
-      <w:r>
-        <w:t xml:space="preserve"> </w:t>
-      </w:r>
-      <w:r>
-        <w:t xml:space="preserve">(Trust</w:t>
-      </w:r>
-      <w:r>
-        <w:t xml:space="preserve"> </w:t>
-      </w:r>
-      <w:r>
-        <w:t xml:space="preserve">Exploitation Index) is an agent’s mean non-showdown profit per</w:t>
-      </w:r>
-      <w:r>
-        <w:t xml:space="preserve"> </w:t>
-      </w:r>
-      <w:r>
-        <w:t xml:space="preserve">hand—value won through fold equity rather than at showdown.</w:t>
+        <w:t xml:space="preserve">walkover</w:t>
+      </w:r>
+      <w:r>
+        <w:t xml:space="preserve"> </w:t>
+      </w:r>
+      <w:r>
+        <w:t xml:space="preserve">(or</w:t>
+      </w:r>
+      <w:r>
+        <w:t xml:space="preserve"> </w:t>
+      </w:r>
+      <w:r>
+        <w:t xml:space="preserve">“</w:t>
+      </w:r>
+      <w:r>
+        <w:t xml:space="preserve">uncontested pot</w:t>
+      </w:r>
+      <w:r>
+        <w:t xml:space="preserve">”</w:t>
+      </w:r>
+      <w:r>
+        <w:t xml:space="preserve">) is a hand won without showdown—every other</w:t>
+      </w:r>
+      <w:r>
+        <w:t xml:space="preserve"> </w:t>
+      </w:r>
+      <w:r>
+        <w:t xml:space="preserve">player folded before the cards had to be shown. It is the</w:t>
+      </w:r>
+      <w:r>
+        <w:t xml:space="preserve"> </w:t>
+      </w:r>
+      <w:r>
+        <w:t xml:space="preserve">bread-and-butter outcome for aggressive players who win by making</w:t>
+      </w:r>
+      <w:r>
+        <w:t xml:space="preserve"> </w:t>
+      </w:r>
+      <w:r>
+        <w:t xml:space="preserve">opponents fold rather than by holding the best hand.</w:t>
       </w:r>
     </w:p>
   </w:footnote>
-  <w:footnote w:id="45">
+  <w:footnote w:id="48">
     <w:p>
       <w:pPr>
         <w:pStyle w:val="FootnoteText"/>
@@ -24108,29 +22920,64 @@
           <w:iCs/>
           <w:i/>
         </w:rPr>
-        <w:t xml:space="preserve">CS</w:t>
-      </w:r>
-      <w:r>
-        <w:t xml:space="preserve"> </w:t>
-      </w:r>
-      <w:r>
-        <w:t xml:space="preserve">(Context</w:t>
-      </w:r>
-      <w:r>
-        <w:t xml:space="preserve"> </w:t>
-      </w:r>
-      <w:r>
-        <w:t xml:space="preserve">Sensitivity) is the absolute correlation between an opponent’s recent</w:t>
-      </w:r>
-      <w:r>
-        <w:t xml:space="preserve"> </w:t>
-      </w:r>
-      <w:r>
-        <w:t xml:space="preserve">aggression and the agent’s own action.</w:t>
+        <w:t xml:space="preserve">Hand rank</w:t>
+      </w:r>
+      <w:r>
+        <w:t xml:space="preserve"> </w:t>
+      </w:r>
+      <w:r>
+        <w:t xml:space="preserve">is taken from standard 7-card poker equity tables: rank 1 is the</w:t>
+      </w:r>
+      <w:r>
+        <w:t xml:space="preserve"> </w:t>
+      </w:r>
+      <w:r>
+        <w:t xml:space="preserve">strongest possible hand and rank 7,462 is the weakest. Rank</w:t>
+      </w:r>
+      <w:r>
+        <w:t xml:space="preserve"> </w:t>
+      </w:r>
+      <m:oMath>
+        <m:r>
+          <m:rPr>
+            <m:sty m:val="p"/>
+          </m:rPr>
+          <m:t>≤</m:t>
+        </m:r>
+        <m:r>
+          <m:t>1</m:t>
+        </m:r>
+        <m:r>
+          <m:rPr>
+            <m:sty m:val="p"/>
+          </m:rPr>
+          <m:t>,</m:t>
+        </m:r>
+        <m:r>
+          <m:t>000</m:t>
+        </m:r>
+      </m:oMath>
+      <w:r>
+        <w:t xml:space="preserve"> </w:t>
+      </w:r>
+      <w:r>
+        <w:t xml:space="preserve">is roughly</w:t>
+      </w:r>
+      <w:r>
+        <w:t xml:space="preserve"> </w:t>
+      </w:r>
+      <w:r>
+        <w:t xml:space="preserve">“</w:t>
+      </w:r>
+      <w:r>
+        <w:t xml:space="preserve">top 15% of hands.</w:t>
+      </w:r>
+      <w:r>
+        <w:t xml:space="preserve">”</w:t>
       </w:r>
     </w:p>
   </w:footnote>
-  <w:footnote w:id="46">
+  <w:footnote w:id="49">
     <w:p>
       <w:pPr>
         <w:pStyle w:val="FootnoteText"/>
@@ -24149,277 +22996,57 @@
           <w:iCs/>
           <w:i/>
         </w:rPr>
-        <w:t xml:space="preserve">OA</w:t>
-      </w:r>
-      <w:r>
-        <w:t xml:space="preserve"> </w:t>
-      </w:r>
-      <w:r>
-        <w:t xml:space="preserve">(Opponent Adaptation) is the variance of</w:t>
-      </w:r>
-      <w:r>
-        <w:t xml:space="preserve"> </w:t>
-      </w:r>
-      <w:r>
-        <w:t xml:space="preserve">an agent’s aggression rate across different opponents.</w:t>
+        <w:t xml:space="preserve">3-bet</w:t>
+      </w:r>
+      <w:r>
+        <w:t xml:space="preserve"> </w:t>
+      </w:r>
+      <w:r>
+        <w:t xml:space="preserve">and</w:t>
+      </w:r>
+      <w:r>
+        <w:t xml:space="preserve"> </w:t>
+      </w:r>
+      <w:r>
+        <w:rPr>
+          <w:iCs/>
+          <w:i/>
+        </w:rPr>
+        <w:t xml:space="preserve">4-bet</w:t>
+      </w:r>
+      <w:r>
+        <w:t xml:space="preserve"> </w:t>
+      </w:r>
+      <w:r>
+        <w:t xml:space="preserve">refer to</w:t>
+      </w:r>
+      <w:r>
+        <w:t xml:space="preserve"> </w:t>
+      </w:r>
+      <w:r>
+        <w:t xml:space="preserve">successive re-raises. The big blind counts as the first bet; a</w:t>
+      </w:r>
+      <w:r>
+        <w:t xml:space="preserve"> </w:t>
+      </w:r>
+      <w:r>
+        <w:t xml:space="preserve">raise is the 2-bet; a re-raise is the 3-bet; another re-raise is</w:t>
+      </w:r>
+      <w:r>
+        <w:t xml:space="preserve"> </w:t>
+      </w:r>
+      <w:r>
+        <w:t xml:space="preserve">the 4-bet. Under our four-bet cap, no further raises are allowed</w:t>
+      </w:r>
+      <w:r>
+        <w:t xml:space="preserve"> </w:t>
+      </w:r>
+      <w:r>
+        <w:t xml:space="preserve">in the same round.</w:t>
       </w:r>
     </w:p>
   </w:footnote>
-  <w:footnote w:id="47">
-    <w:p>
-      <w:pPr>
-        <w:pStyle w:val="FootnoteText"/>
-      </w:pPr>
-      <w:r>
-        <w:rPr>
-          <w:rStyle w:val="FootnoteReference"/>
-        </w:rPr>
-        <w:footnoteRef/>
-      </w:r>
-      <w:r>
-        <w:t xml:space="preserve"> </w:t>
-      </w:r>
-      <w:r>
-        <w:rPr>
-          <w:iCs/>
-          <w:i/>
-        </w:rPr>
-        <w:t xml:space="preserve">NS</w:t>
-      </w:r>
-      <w:r>
-        <w:t xml:space="preserve"> </w:t>
-      </w:r>
-      <w:r>
-        <w:t xml:space="preserve">(Non-Stationarity)</w:t>
-      </w:r>
-      <w:r>
-        <w:t xml:space="preserve"> </w:t>
-      </w:r>
-      <w:r>
-        <w:t xml:space="preserve">gauges how much an agent’s action distribution drifts over the run,</w:t>
-      </w:r>
-      <w:r>
-        <w:t xml:space="preserve"> </w:t>
-      </w:r>
-      <w:r>
-        <w:t xml:space="preserve">comparing 500-hand windows against its overall distribution.</w:t>
-      </w:r>
-    </w:p>
-  </w:footnote>
-  <w:footnote w:id="50">
-    <w:p>
-      <w:pPr>
-        <w:pStyle w:val="FootnoteText"/>
-      </w:pPr>
-      <w:r>
-        <w:rPr>
-          <w:rStyle w:val="FootnoteReference"/>
-        </w:rPr>
-        <w:footnoteRef/>
-      </w:r>
-      <w:r>
-        <w:t xml:space="preserve"> </w:t>
-      </w:r>
-      <w:r>
-        <w:t xml:space="preserve">A</w:t>
-      </w:r>
-      <w:r>
-        <w:t xml:space="preserve"> </w:t>
-      </w:r>
-      <w:r>
-        <w:rPr>
-          <w:iCs/>
-          <w:i/>
-        </w:rPr>
-        <w:t xml:space="preserve">walkover</w:t>
-      </w:r>
-      <w:r>
-        <w:t xml:space="preserve"> </w:t>
-      </w:r>
-      <w:r>
-        <w:t xml:space="preserve">(or</w:t>
-      </w:r>
-      <w:r>
-        <w:t xml:space="preserve"> </w:t>
-      </w:r>
-      <w:r>
-        <w:t xml:space="preserve">“</w:t>
-      </w:r>
-      <w:r>
-        <w:t xml:space="preserve">uncontested pot</w:t>
-      </w:r>
-      <w:r>
-        <w:t xml:space="preserve">”</w:t>
-      </w:r>
-      <w:r>
-        <w:t xml:space="preserve">) is a hand won without showdown—every other</w:t>
-      </w:r>
-      <w:r>
-        <w:t xml:space="preserve"> </w:t>
-      </w:r>
-      <w:r>
-        <w:t xml:space="preserve">player folded before the cards had to be shown. It is the</w:t>
-      </w:r>
-      <w:r>
-        <w:t xml:space="preserve"> </w:t>
-      </w:r>
-      <w:r>
-        <w:t xml:space="preserve">bread-and-butter outcome for aggressive players who win by making</w:t>
-      </w:r>
-      <w:r>
-        <w:t xml:space="preserve"> </w:t>
-      </w:r>
-      <w:r>
-        <w:t xml:space="preserve">opponents fold rather than by holding the best hand.</w:t>
-      </w:r>
-    </w:p>
-  </w:footnote>
-  <w:footnote w:id="54">
-    <w:p>
-      <w:pPr>
-        <w:pStyle w:val="FootnoteText"/>
-      </w:pPr>
-      <w:r>
-        <w:rPr>
-          <w:rStyle w:val="FootnoteReference"/>
-        </w:rPr>
-        <w:footnoteRef/>
-      </w:r>
-      <w:r>
-        <w:t xml:space="preserve"> </w:t>
-      </w:r>
-      <w:r>
-        <w:rPr>
-          <w:iCs/>
-          <w:i/>
-        </w:rPr>
-        <w:t xml:space="preserve">Hand rank</w:t>
-      </w:r>
-      <w:r>
-        <w:t xml:space="preserve"> </w:t>
-      </w:r>
-      <w:r>
-        <w:t xml:space="preserve">is taken from standard 7-card poker equity tables: rank 1 is the</w:t>
-      </w:r>
-      <w:r>
-        <w:t xml:space="preserve"> </w:t>
-      </w:r>
-      <w:r>
-        <w:t xml:space="preserve">strongest possible hand and rank 7,462 is the weakest. Rank</w:t>
-      </w:r>
-      <w:r>
-        <w:t xml:space="preserve"> </w:t>
-      </w:r>
-      <m:oMath>
-        <m:r>
-          <m:rPr>
-            <m:sty m:val="p"/>
-          </m:rPr>
-          <m:t>≤</m:t>
-        </m:r>
-        <m:r>
-          <m:t>1</m:t>
-        </m:r>
-        <m:r>
-          <m:rPr>
-            <m:sty m:val="p"/>
-          </m:rPr>
-          <m:t>,</m:t>
-        </m:r>
-        <m:r>
-          <m:t>000</m:t>
-        </m:r>
-      </m:oMath>
-      <w:r>
-        <w:t xml:space="preserve"> </w:t>
-      </w:r>
-      <w:r>
-        <w:t xml:space="preserve">is roughly</w:t>
-      </w:r>
-      <w:r>
-        <w:t xml:space="preserve"> </w:t>
-      </w:r>
-      <w:r>
-        <w:t xml:space="preserve">“</w:t>
-      </w:r>
-      <w:r>
-        <w:t xml:space="preserve">top 15% of hands.</w:t>
-      </w:r>
-      <w:r>
-        <w:t xml:space="preserve">”</w:t>
-      </w:r>
-    </w:p>
-  </w:footnote>
-  <w:footnote w:id="55">
-    <w:p>
-      <w:pPr>
-        <w:pStyle w:val="FootnoteText"/>
-      </w:pPr>
-      <w:r>
-        <w:rPr>
-          <w:rStyle w:val="FootnoteReference"/>
-        </w:rPr>
-        <w:footnoteRef/>
-      </w:r>
-      <w:r>
-        <w:t xml:space="preserve"> </w:t>
-      </w:r>
-      <w:r>
-        <w:rPr>
-          <w:iCs/>
-          <w:i/>
-        </w:rPr>
-        <w:t xml:space="preserve">3-bet</w:t>
-      </w:r>
-      <w:r>
-        <w:t xml:space="preserve"> </w:t>
-      </w:r>
-      <w:r>
-        <w:t xml:space="preserve">and</w:t>
-      </w:r>
-      <w:r>
-        <w:t xml:space="preserve"> </w:t>
-      </w:r>
-      <w:r>
-        <w:rPr>
-          <w:iCs/>
-          <w:i/>
-        </w:rPr>
-        <w:t xml:space="preserve">4-bet</w:t>
-      </w:r>
-      <w:r>
-        <w:t xml:space="preserve"> </w:t>
-      </w:r>
-      <w:r>
-        <w:t xml:space="preserve">refer to</w:t>
-      </w:r>
-      <w:r>
-        <w:t xml:space="preserve"> </w:t>
-      </w:r>
-      <w:r>
-        <w:t xml:space="preserve">successive re-raises. The big blind counts as the first bet; a</w:t>
-      </w:r>
-      <w:r>
-        <w:t xml:space="preserve"> </w:t>
-      </w:r>
-      <w:r>
-        <w:t xml:space="preserve">raise is the 2-bet; a re-raise is the 3-bet; another re-raise is</w:t>
-      </w:r>
-      <w:r>
-        <w:t xml:space="preserve"> </w:t>
-      </w:r>
-      <w:r>
-        <w:t xml:space="preserve">the 4-bet. Under our four-bet cap, no further raises are allowed</w:t>
-      </w:r>
-      <w:r>
-        <w:t xml:space="preserve"> </w:t>
-      </w:r>
-      <w:r>
-        <w:t xml:space="preserve">in the same round.</w:t>
-      </w:r>
-    </w:p>
-  </w:footnote>
-  <w:footnote w:id="58">
+  <w:footnote w:id="52">
     <w:p>
       <w:pPr>
         <w:pStyle w:val="FootnoteText"/>
@@ -24510,7 +23137,7 @@
       </w:r>
     </w:p>
   </w:footnote>
-  <w:footnote w:id="70">
+  <w:footnote w:id="64">
     <w:p>
       <w:pPr>
         <w:pStyle w:val="FootnoteText"/>
@@ -24557,7 +23184,7 @@
       </w:r>
     </w:p>
   </w:footnote>
-  <w:footnote w:id="71">
+  <w:footnote w:id="65">
     <w:p>
       <w:pPr>
         <w:pStyle w:val="FootnoteText"/>
@@ -24609,7 +23236,7 @@
       </w:r>
     </w:p>
   </w:footnote>
-  <w:footnote w:id="72">
+  <w:footnote w:id="66">
     <w:p>
       <w:pPr>
         <w:pStyle w:val="FootnoteText"/>
@@ -24735,7 +23362,7 @@
       </w:r>
     </w:p>
   </w:footnote>
-  <w:footnote w:id="73">
+  <w:footnote w:id="67">
     <w:p>
       <w:pPr>
         <w:pStyle w:val="FootnoteText"/>
@@ -24776,7 +23403,7 @@
       </w:r>
     </w:p>
   </w:footnote>
-  <w:footnote w:id="81">
+  <w:footnote w:id="75">
     <w:p>
       <w:pPr>
         <w:pStyle w:val="FootnoteText"/>
@@ -24839,7 +23466,7 @@
       </w:r>
     </w:p>
   </w:footnote>
-  <w:footnote w:id="82">
+  <w:footnote w:id="76">
     <w:p>
       <w:pPr>
         <w:pStyle w:val="FootnoteText"/>

</xml_diff>

<commit_message>
paper: v13 — insert author's paraphrased text over the review-fix drafts
Replaced the crimson \W{} drafts with the author's final wording
(un-highlighted) for: the eBay/transparency-paradox reframe (#1),
nominal-honesty note (#10), the byte-identical clarifications (#2, three
spots), the collinear-points caveat (#14), the descriptive-metrics note
(#12), the Phase 2* ladder note (#24), the TEI/CS/OA/NS definitions (#8),
the Box 1 clause (#17), and the TMA "farming" caveat (#15).

Notes: the author's eBay paraphrase drops the Bolton citation (kept R&Z
+ Glosten). Corrected one factual slip in the nominal-honesty paragraph
(listed Sentinel as state-switching; it is static, so the state-switchers
are Predator/Judge/Mirror).

Two \W{} blocks remain (not yet paraphrased by the author): the Discussion
opener and the one-sample-t significance note (5.4).

Build clean; no undefined refs; 12 pages.
</commit_message>
<xml_diff>
--- a/paper_resources/manuscript/main.docx
+++ b/paper_resources/manuscript/main.docx
@@ -1787,13 +1787,13 @@
         <w:pStyle w:val="FirstParagraph"/>
       </w:pPr>
       <w:r>
-        <w:t xml:space="preserve">First, there is the empirical economics of online reputation</w:t>
-      </w:r>
-      <w:r>
-        <w:t xml:space="preserve"> </w:t>
-      </w:r>
-      <w:r>
-        <w:t xml:space="preserve">systems. Resnick &amp; Zeckhauser’s large-scale study of eBay</w:t>
+        <w:t xml:space="preserve">An empirical approach to understanding the economics of online</w:t>
+      </w:r>
+      <w:r>
+        <w:t xml:space="preserve"> </w:t>
+      </w:r>
+      <w:r>
+        <w:t xml:space="preserve">reputation systems has been conducted by Resnick &amp; Zeckhauser</w:t>
       </w:r>
       <w:r>
         <w:t xml:space="preserve"> </w:t>
@@ -1802,122 +1802,103 @@
         <w:t xml:space="preserve">[1]</w:t>
       </w:r>
       <w:r>
-        <w:t xml:space="preserve"> </w:t>
-      </w:r>
-      <w:r>
-        <w:t xml:space="preserve">documented that feedback is provided more</w:t>
-      </w:r>
-      <w:r>
-        <w:t xml:space="preserve"> </w:t>
-      </w:r>
-      <w:r>
-        <w:t xml:space="preserve">than half the time and is almost always positive, with sellers</w:t>
-      </w:r>
-      <w:r>
-        <w:t xml:space="preserve"> </w:t>
-      </w:r>
-      <w:r>
-        <w:t xml:space="preserve">receiving negative feedback only about 1% of the time—evidence</w:t>
-      </w:r>
-      <w:r>
-        <w:t xml:space="preserve"> </w:t>
-      </w:r>
-      <w:r>
-        <w:t xml:space="preserve">that observable reputation is pervasive and that markets broadly</w:t>
-      </w:r>
-      <w:r>
-        <w:t xml:space="preserve"> </w:t>
-      </w:r>
-      <w:r>
-        <w:t xml:space="preserve">reward good behavior rather than penalize it. The motivating tension</w:t>
-      </w:r>
-      <w:r>
-        <w:t xml:space="preserve"> </w:t>
-      </w:r>
-      <w:r>
-        <w:t xml:space="preserve">for our work is therefore a theoretical</w:t>
-      </w:r>
-      <w:r>
-        <w:t xml:space="preserve"> </w:t>
-      </w:r>
-      <w:r>
-        <w:rPr>
-          <w:iCs/>
-          <w:i/>
-        </w:rPr>
-        <w:t xml:space="preserve">transparency paradox</w:t>
-      </w:r>
-      <w:r>
-        <w:t xml:space="preserve"> </w:t>
-      </w:r>
-      <w:r>
-        <w:t xml:space="preserve">rather than a settled empirical fact: when a cooperator’s behavior is</w:t>
-      </w:r>
-      <w:r>
-        <w:t xml:space="preserve"> </w:t>
-      </w:r>
-      <w:r>
-        <w:t xml:space="preserve">perfectly predictable, a sufficiently sophisticated counterparty can</w:t>
-      </w:r>
-      <w:r>
-        <w:t xml:space="preserve"> </w:t>
-      </w:r>
-      <w:r>
-        <w:t xml:space="preserve">plan around it and extract value, so visible cooperation could in</w:t>
-      </w:r>
-      <w:r>
-        <w:t xml:space="preserve"> </w:t>
-      </w:r>
-      <w:r>
-        <w:t xml:space="preserve">principle be exploited. The cleanest controlled evidence on eBay in</w:t>
-      </w:r>
-      <w:r>
-        <w:t xml:space="preserve"> </w:t>
-      </w:r>
-      <w:r>
-        <w:t xml:space="preserve">fact points the other way—toward a reputation premium for</w:t>
-      </w:r>
-      <w:r>
-        <w:t xml:space="preserve"> </w:t>
-      </w:r>
-      <w:r>
-        <w:t xml:space="preserve">established identities—which makes the paradox a hypothesis worth</w:t>
-      </w:r>
-      <w:r>
-        <w:t xml:space="preserve"> </w:t>
-      </w:r>
-      <w:r>
-        <w:t xml:space="preserve">testing rather than a documented effect. Bolton, Katok, &amp; Ockenfels</w:t>
-      </w:r>
-      <w:r>
-        <w:t xml:space="preserve"> </w:t>
-      </w:r>
-      <w:r>
-        <w:t xml:space="preserve">[2]</w:t>
-      </w:r>
-      <w:r>
-        <w:t xml:space="preserve"> </w:t>
-      </w:r>
-      <w:r>
-        <w:t xml:space="preserve">examine how reputation institutions shape</w:t>
-      </w:r>
-      <w:r>
-        <w:t xml:space="preserve"> </w:t>
-      </w:r>
-      <w:r>
-        <w:t xml:space="preserve">cooperation in controlled trust games, and an analogous dynamic</w:t>
-      </w:r>
-      <w:r>
-        <w:t xml:space="preserve"> </w:t>
-      </w:r>
-      <w:r>
-        <w:t xml:space="preserve">appears in financial-market microstructure, where adverse selection</w:t>
-      </w:r>
-      <w:r>
-        <w:t xml:space="preserve"> </w:t>
-      </w:r>
-      <w:r>
-        <w:t xml:space="preserve">against predictably behaving market makers</w:t>
+        <w:t xml:space="preserve">, who have documented that, based on</w:t>
+      </w:r>
+      <w:r>
+        <w:t xml:space="preserve"> </w:t>
+      </w:r>
+      <w:r>
+        <w:t xml:space="preserve">large-scale data from eBay, feedback is submitted by users greater</w:t>
+      </w:r>
+      <w:r>
+        <w:t xml:space="preserve"> </w:t>
+      </w:r>
+      <w:r>
+        <w:t xml:space="preserve">than fifty percent of the time and is virtually all positive, with</w:t>
+      </w:r>
+      <w:r>
+        <w:t xml:space="preserve"> </w:t>
+      </w:r>
+      <w:r>
+        <w:t xml:space="preserve">sellers receiving negative feedback less than 1% of the time (i.e.,</w:t>
+      </w:r>
+      <w:r>
+        <w:t xml:space="preserve"> </w:t>
+      </w:r>
+      <w:r>
+        <w:t xml:space="preserve">evidence of ubiquitous observable reputation and markets rewarding</w:t>
+      </w:r>
+      <w:r>
+        <w:t xml:space="preserve"> </w:t>
+      </w:r>
+      <w:r>
+        <w:t xml:space="preserve">good behavior). Therefore, the motivation behind our research is a</w:t>
+      </w:r>
+      <w:r>
+        <w:t xml:space="preserve"> </w:t>
+      </w:r>
+      <w:r>
+        <w:t xml:space="preserve">theoretical transparency paradox rather than an empirically verified</w:t>
+      </w:r>
+      <w:r>
+        <w:t xml:space="preserve"> </w:t>
+      </w:r>
+      <w:r>
+        <w:t xml:space="preserve">phenomenon: when the behavior of a cooperator is completely</w:t>
+      </w:r>
+      <w:r>
+        <w:t xml:space="preserve"> </w:t>
+      </w:r>
+      <w:r>
+        <w:t xml:space="preserve">predictable, a sufficiently astute counterpart can plan accordingly</w:t>
+      </w:r>
+      <w:r>
+        <w:t xml:space="preserve"> </w:t>
+      </w:r>
+      <w:r>
+        <w:t xml:space="preserve">and take advantage of the cooperator’s actions—hence potentially</w:t>
+      </w:r>
+      <w:r>
+        <w:t xml:space="preserve"> </w:t>
+      </w:r>
+      <w:r>
+        <w:t xml:space="preserve">creating conditions under which visible cooperation could be</w:t>
+      </w:r>
+      <w:r>
+        <w:t xml:space="preserve"> </w:t>
+      </w:r>
+      <w:r>
+        <w:t xml:space="preserve">exploited. Controlled studies using eBay actually point in the</w:t>
+      </w:r>
+      <w:r>
+        <w:t xml:space="preserve"> </w:t>
+      </w:r>
+      <w:r>
+        <w:t xml:space="preserve">opposite direction, i.e., toward a reputation premium associated with</w:t>
+      </w:r>
+      <w:r>
+        <w:t xml:space="preserve"> </w:t>
+      </w:r>
+      <w:r>
+        <w:t xml:space="preserve">established identities—thus making the paradox a hypothesis worth</w:t>
+      </w:r>
+      <w:r>
+        <w:t xml:space="preserve"> </w:t>
+      </w:r>
+      <w:r>
+        <w:t xml:space="preserve">testing versus an empirically demonstrated effect. A similar dynamic</w:t>
+      </w:r>
+      <w:r>
+        <w:t xml:space="preserve"> </w:t>
+      </w:r>
+      <w:r>
+        <w:t xml:space="preserve">is observed in financial-market microstructure, where adverse</w:t>
+      </w:r>
+      <w:r>
+        <w:t xml:space="preserve"> </w:t>
+      </w:r>
+      <w:r>
+        <w:t xml:space="preserve">selection against predictably acting market-makers</w:t>
       </w:r>
       <w:r>
         <w:t xml:space="preserve"> </w:t>
@@ -1929,31 +1910,43 @@
         <w:t xml:space="preserve"> </w:t>
       </w:r>
       <w:r>
-        <w:t xml:space="preserve">produces related effects through asymmetric information. What this</w:t>
-      </w:r>
-      <w:r>
-        <w:t xml:space="preserve"> </w:t>
-      </w:r>
-      <w:r>
-        <w:t xml:space="preserve">literature cannot settle—because it does not re-engineer the</w:t>
-      </w:r>
-      <w:r>
-        <w:t xml:space="preserve"> </w:t>
-      </w:r>
-      <w:r>
-        <w:t xml:space="preserve">population of agents—is whether the paradox would survive if</w:t>
-      </w:r>
-      <w:r>
-        <w:t xml:space="preserve"> </w:t>
-      </w:r>
-      <w:r>
-        <w:t xml:space="preserve">cooperative actors were intelligent enough to avoid being exploited;</w:t>
-      </w:r>
-      <w:r>
-        <w:t xml:space="preserve"> </w:t>
-      </w:r>
-      <w:r>
-        <w:t xml:space="preserve">that gap is what our controlled simulation is built to probe.</w:t>
+        <w:t xml:space="preserve">creates equivalent problems due to differences</w:t>
+      </w:r>
+      <w:r>
+        <w:t xml:space="preserve"> </w:t>
+      </w:r>
+      <w:r>
+        <w:t xml:space="preserve">in information asymmetry. However, because the prior literature does</w:t>
+      </w:r>
+      <w:r>
+        <w:t xml:space="preserve"> </w:t>
+      </w:r>
+      <w:r>
+        <w:t xml:space="preserve">not replicate or alter the population of agents participating in such</w:t>
+      </w:r>
+      <w:r>
+        <w:t xml:space="preserve"> </w:t>
+      </w:r>
+      <w:r>
+        <w:t xml:space="preserve">interactions, it cannot determine whether the paradox would remain</w:t>
+      </w:r>
+      <w:r>
+        <w:t xml:space="preserve"> </w:t>
+      </w:r>
+      <w:r>
+        <w:t xml:space="preserve">even if cooperative agents had sufficient intelligence to prevent</w:t>
+      </w:r>
+      <w:r>
+        <w:t xml:space="preserve"> </w:t>
+      </w:r>
+      <w:r>
+        <w:t xml:space="preserve">being taken advantage of—so a controlled simulation was developed</w:t>
+      </w:r>
+      <w:r>
+        <w:t xml:space="preserve"> </w:t>
+      </w:r>
+      <w:r>
+        <w:t xml:space="preserve">to address that question.</w:t>
       </w:r>
     </w:p>
     <w:tbl>
@@ -6109,7 +6102,13 @@
         <w:t xml:space="preserve"> </w:t>
       </w:r>
       <w:r>
-        <w:t xml:space="preserve">score. For state-switching archetypes (</w:t>
+        <w:t xml:space="preserve">score. As previously stated, because the state-switching archetypes</w:t>
+      </w:r>
+      <w:r>
+        <w:t xml:space="preserve"> </w:t>
+      </w:r>
+      <w:r>
+        <w:t xml:space="preserve">(</w:t>
       </w:r>
       <w:r>
         <w:rPr>
@@ -6132,7 +6131,7 @@
         <w:t xml:space="preserve">Judge</w:t>
       </w:r>
       <w:r>
-        <w:t xml:space="preserve">,</w:t>
+        <w:t xml:space="preserve">, and</w:t>
       </w:r>
       <w:r>
         <w:t xml:space="preserve"> </w:t>
@@ -6145,7 +6144,13 @@
         <w:t xml:space="preserve">Mirror</w:t>
       </w:r>
       <w:r>
-        <w:t xml:space="preserve">),</w:t>
+        <w:t xml:space="preserve">) have different</w:t>
+      </w:r>
+      <w:r>
+        <w:t xml:space="preserve"> </w:t>
+      </w:r>
+      <w:r>
+        <w:t xml:space="preserve">characteristics that define their level of honesty across states,</w:t>
       </w:r>
       <w:r>
         <w:t xml:space="preserve"> </w:t>
@@ -6172,31 +6177,37 @@
         <w:t xml:space="preserve"> </w:t>
       </w:r>
       <w:r>
-        <w:t xml:space="preserve">is the archetype’s canonical,</w:t>
-      </w:r>
-      <w:r>
-        <w:t xml:space="preserve"> </w:t>
-      </w:r>
-      <w:r>
-        <w:t xml:space="preserve">nominal honesty—the value implied by its specified mean bluff rate,</w:t>
-      </w:r>
-      <w:r>
-        <w:t xml:space="preserve"> </w:t>
-      </w:r>
-      <w:r>
-        <w:t xml:space="preserve">not its realized honesty in a particular state—so trust is the</w:t>
-      </w:r>
-      <w:r>
-        <w:t xml:space="preserve"> </w:t>
-      </w:r>
-      <w:r>
-        <w:t xml:space="preserve">honesty an observer expects given the type it believes the agent to</w:t>
-      </w:r>
-      <w:r>
-        <w:t xml:space="preserve"> </w:t>
-      </w:r>
-      <w:r>
-        <w:t xml:space="preserve">be. There are many reasonable ways to define the trust score;</w:t>
+        <w:t xml:space="preserve">represents each archetype’s nominal, canonical level of</w:t>
+      </w:r>
+      <w:r>
+        <w:t xml:space="preserve"> </w:t>
+      </w:r>
+      <w:r>
+        <w:t xml:space="preserve">honesty—that is, the expected level of honesty implied by their</w:t>
+      </w:r>
+      <w:r>
+        <w:t xml:space="preserve"> </w:t>
+      </w:r>
+      <w:r>
+        <w:t xml:space="preserve">respective mean bluff rates—and not their actual level of honesty</w:t>
+      </w:r>
+      <w:r>
+        <w:t xml:space="preserve"> </w:t>
+      </w:r>
+      <w:r>
+        <w:t xml:space="preserve">in a specific state. As such, trust will represent the expected level</w:t>
+      </w:r>
+      <w:r>
+        <w:t xml:space="preserve"> </w:t>
+      </w:r>
+      <w:r>
+        <w:t xml:space="preserve">of honesty that an observer anticipates based upon the type it</w:t>
+      </w:r>
+      <w:r>
+        <w:t xml:space="preserve"> </w:t>
+      </w:r>
+      <w:r>
+        <w:t xml:space="preserve">believes the agent to be. There are many reasonable ways to define the trust score;</w:t>
       </w:r>
       <w:r>
         <w:t xml:space="preserve"> </w:t>
@@ -6366,7 +6377,7 @@
         <w:t xml:space="preserve"> </w:t>
       </w:r>
       <w:r>
-        <w:t xml:space="preserve">Strictly,</w:t>
+        <w:t xml:space="preserve">Although, strictly speaking,</w:t>
       </w:r>
       <w:r>
         <w:t xml:space="preserve"> </w:t>
@@ -6398,7 +6409,7 @@
         <w:t xml:space="preserve"> </w:t>
       </w:r>
       <w:r>
-        <w:t xml:space="preserve">are byte-identical, whereas</w:t>
+        <w:t xml:space="preserve">are byte-identical,</w:t>
       </w:r>
       <w:r>
         <w:t xml:space="preserve"> </w:t>
@@ -6414,19 +6425,67 @@
         <w:t xml:space="preserve"> </w:t>
       </w:r>
       <w:r>
-        <w:t xml:space="preserve">differs only</w:t>
-      </w:r>
-      <w:r>
-        <w:t xml:space="preserve"> </w:t>
-      </w:r>
-      <w:r>
-        <w:t xml:space="preserve">marginally and additionally blends toward its target at runtime, so</w:t>
-      </w:r>
-      <w:r>
-        <w:t xml:space="preserve"> </w:t>
-      </w:r>
-      <w:r>
-        <w:t xml:space="preserve">its realized behavior diverges (Table 3).</w:t>
+        <w:t xml:space="preserve">varies only slightly from</w:t>
+      </w:r>
+      <w:r>
+        <w:t xml:space="preserve"> </w:t>
+      </w:r>
+      <w:r>
+        <w:rPr>
+          <w:bCs/>
+          <w:b/>
+        </w:rPr>
+        <w:t xml:space="preserve">Sentinel</w:t>
+      </w:r>
+      <w:r>
+        <w:t xml:space="preserve"> </w:t>
+      </w:r>
+      <w:r>
+        <w:t xml:space="preserve">and also dynamically</w:t>
+      </w:r>
+      <w:r>
+        <w:t xml:space="preserve"> </w:t>
+      </w:r>
+      <w:r>
+        <w:t xml:space="preserve">adjusts toward its target at runtime; as a result, the realized</w:t>
+      </w:r>
+      <w:r>
+        <w:t xml:space="preserve"> </w:t>
+      </w:r>
+      <w:r>
+        <w:t xml:space="preserve">behavior of</w:t>
+      </w:r>
+      <w:r>
+        <w:t xml:space="preserve"> </w:t>
+      </w:r>
+      <w:r>
+        <w:rPr>
+          <w:bCs/>
+          <w:b/>
+        </w:rPr>
+        <w:t xml:space="preserve">Mirror</w:t>
+      </w:r>
+      <w:r>
+        <w:t xml:space="preserve"> </w:t>
+      </w:r>
+      <w:r>
+        <w:t xml:space="preserve">differs from that of</w:t>
+      </w:r>
+      <w:r>
+        <w:t xml:space="preserve"> </w:t>
+      </w:r>
+      <w:r>
+        <w:rPr>
+          <w:bCs/>
+          <w:b/>
+        </w:rPr>
+        <w:t xml:space="preserve">Sentinel</w:t>
+      </w:r>
+      <w:r>
+        <w:t xml:space="preserve"> </w:t>
+      </w:r>
+      <w:r>
+        <w:t xml:space="preserve">(see Table 3).</w:t>
       </w:r>
       <w:r>
         <w:t xml:space="preserve"> </w:t>
@@ -7097,19 +7156,19 @@
         <w:t xml:space="preserve"> </w:t>
       </w:r>
       <w:r>
-        <w:t xml:space="preserve">Because these eight points are a fixed, designed set—with two or</w:t>
-      </w:r>
-      <w:r>
-        <w:t xml:space="preserve"> </w:t>
-      </w:r>
-      <w:r>
-        <w:t xml:space="preserve">three archetypes clustered at nearly the same trust value—each</w:t>
-      </w:r>
-      <w:r>
-        <w:t xml:space="preserve"> </w:t>
-      </w:r>
-      <w:r>
-        <w:t xml:space="preserve">per-seed</w:t>
+        <w:t xml:space="preserve">Since these eight points represent a predefined, engineered</w:t>
+      </w:r>
+      <w:r>
+        <w:t xml:space="preserve"> </w:t>
+      </w:r>
+      <w:r>
+        <w:t xml:space="preserve">set—with two or three archetypes clustering at nearly equal trust</w:t>
+      </w:r>
+      <w:r>
+        <w:t xml:space="preserve"> </w:t>
+      </w:r>
+      <w:r>
+        <w:t xml:space="preserve">values—each per-seed</w:t>
       </w:r>
       <w:r>
         <w:t xml:space="preserve"> </w:t>
@@ -7141,13 +7200,19 @@
         <w:t xml:space="preserve"> </w:t>
       </w:r>
       <w:r>
-        <w:t xml:space="preserve">is best read as a descriptive correlation over that</w:t>
-      </w:r>
-      <w:r>
-        <w:t xml:space="preserve"> </w:t>
-      </w:r>
-      <w:r>
-        <w:t xml:space="preserve">design rather than a sample correlation drawn from a population.</w:t>
+        <w:t xml:space="preserve">should be viewed as a descriptive</w:t>
+      </w:r>
+      <w:r>
+        <w:t xml:space="preserve"> </w:t>
+      </w:r>
+      <w:r>
+        <w:t xml:space="preserve">correlation over that design rather than a sample correlation drawn</w:t>
+      </w:r>
+      <w:r>
+        <w:t xml:space="preserve"> </w:t>
+      </w:r>
+      <w:r>
+        <w:t xml:space="preserve">from a population.</w:t>
       </w:r>
     </w:p>
     <w:p>
@@ -7297,19 +7362,19 @@
         <w:t xml:space="preserve"> </w:t>
       </w:r>
       <w:r>
-        <w:t xml:space="preserve">pre-registered. We report them descriptively, not as inferential</w:t>
-      </w:r>
-      <w:r>
-        <w:t xml:space="preserve"> </w:t>
-      </w:r>
-      <w:r>
-        <w:t xml:space="preserve">tests, so an individual value should be read as suggestive rather</w:t>
-      </w:r>
-      <w:r>
-        <w:t xml:space="preserve"> </w:t>
-      </w:r>
-      <w:r>
-        <w:t xml:space="preserve">than as a significance claim.</w:t>
+        <w:t xml:space="preserve">pre-registered. We report the metrics above descriptively, with no inferential</w:t>
+      </w:r>
+      <w:r>
+        <w:t xml:space="preserve"> </w:t>
+      </w:r>
+      <w:r>
+        <w:t xml:space="preserve">tests; an individual value should therefore be interpreted as</w:t>
+      </w:r>
+      <w:r>
+        <w:t xml:space="preserve"> </w:t>
+      </w:r>
+      <w:r>
+        <w:t xml:space="preserve">indicative rather than as a statement of statistical significance.</w:t>
       </w:r>
     </w:p>
     <w:p>
@@ -9194,19 +9259,13 @@
         </m:sSup>
       </m:oMath>
       <w:r>
-        <w:t xml:space="preserve">,</w:t>
-      </w:r>
-      <w:r>
-        <w:t xml:space="preserve"> </w:t>
-      </w:r>
-      <w:r>
-        <w:t xml:space="preserve">an unbounded-optimization robustness check on Phase 2, is reported</w:t>
-      </w:r>
-      <w:r>
-        <w:t xml:space="preserve"> </w:t>
-      </w:r>
-      <w:r>
-        <w:t xml:space="preserve">separately and omitted from this headline sequence) frames the</w:t>
+        <w:t xml:space="preserve">—a separate, unbounded-optimization robustness check</w:t>
+      </w:r>
+      <w:r>
+        <w:t xml:space="preserve"> </w:t>
+      </w:r>
+      <w:r>
+        <w:t xml:space="preserve">on Phase 2—is excluded from this sequential reporting) frames the</w:t>
       </w:r>
       <w:r>
         <w:t xml:space="preserve"> </w:t>
@@ -9691,26 +9750,26 @@
         <w:t xml:space="preserve"> </w:t>
       </w:r>
       <w:r>
-        <w:t xml:space="preserve">(The hand below illustrates</w:t>
-      </w:r>
-      <w:r>
-        <w:t xml:space="preserve"> </w:t>
+        <w:t xml:space="preserve">(</w:t>
       </w:r>
       <w:r>
         <w:rPr>
           <w:bCs/>
           <w:b/>
         </w:rPr>
-        <w:t xml:space="preserve">Wall</w:t>
-      </w:r>
-      <w:r>
-        <w:t xml:space="preserve">’s calling-station leak</w:t>
-      </w:r>
-      <w:r>
-        <w:t xml:space="preserve"> </w:t>
-      </w:r>
-      <w:r>
-        <w:t xml:space="preserve">specifically;</w:t>
+        <w:t xml:space="preserve">Firestorm</w:t>
+      </w:r>
+      <w:r>
+        <w:t xml:space="preserve"> </w:t>
+      </w:r>
+      <w:r>
+        <w:t xml:space="preserve">happens to hold a genuine hand here rather than</w:t>
+      </w:r>
+      <w:r>
+        <w:t xml:space="preserve"> </w:t>
+      </w:r>
+      <w:r>
+        <w:t xml:space="preserve">running a bluff; the hand directly illustrates</w:t>
       </w:r>
       <w:r>
         <w:t xml:space="preserve"> </w:t>
@@ -9720,19 +9779,16 @@
           <w:bCs/>
           <w:b/>
         </w:rPr>
-        <w:t xml:space="preserve">Firestorm</w:t>
-      </w:r>
-      <w:r>
-        <w:t xml:space="preserve"> </w:t>
-      </w:r>
-      <w:r>
-        <w:t xml:space="preserve">happens to hold a genuine hand here</w:t>
-      </w:r>
-      <w:r>
-        <w:t xml:space="preserve"> </w:t>
-      </w:r>
-      <w:r>
-        <w:t xml:space="preserve">rather than running a bluff.)</w:t>
+        <w:t xml:space="preserve">Wall</w:t>
+      </w:r>
+      <w:r>
+        <w:t xml:space="preserve">’s</w:t>
+      </w:r>
+      <w:r>
+        <w:t xml:space="preserve"> </w:t>
+      </w:r>
+      <w:r>
+        <w:t xml:space="preserve">calling-station leak.)</w:t>
       </w:r>
       <w:r>
         <w:t xml:space="preserve"> </w:t>
@@ -11314,13 +11370,13 @@
         <w:t xml:space="preserve"> </w:t>
       </w:r>
       <w:r>
-        <w:t xml:space="preserve">differs only slightly and blends at</w:t>
-      </w:r>
-      <w:r>
-        <w:t xml:space="preserve"> </w:t>
-      </w:r>
-      <w:r>
-        <w:t xml:space="preserve">runtime), so the posterior over the cluster saturates at high</w:t>
+        <w:t xml:space="preserve">is only minimally different and blends</w:t>
+      </w:r>
+      <w:r>
+        <w:t xml:space="preserve"> </w:t>
+      </w:r>
+      <w:r>
+        <w:t xml:space="preserve">at runtime), so the posterior over the cluster saturates at high</w:t>
       </w:r>
       <w:r>
         <w:t xml:space="preserve"> </w:t>
@@ -16391,13 +16447,7 @@
         </m:r>
       </m:oMath>
       <w:r>
-        <w:t xml:space="preserve">. We read the high TMA</w:t>
-      </w:r>
-      <w:r>
-        <w:t xml:space="preserve"> </w:t>
-      </w:r>
-      <w:r>
-        <w:t xml:space="preserve">of these two honest archetypes (</w:t>
+        <w:t xml:space="preserve">. The high TMA of these two honest types (</w:t>
       </w:r>
       <w:r>
         <w:rPr>
@@ -16407,21 +16457,12 @@
         <w:t xml:space="preserve">Wall</w:t>
       </w:r>
       <w:r>
-        <w:t xml:space="preserve">,</w:t>
+        <w:t xml:space="preserve">, honesty</w:t>
       </w:r>
       <w:r>
         <w:t xml:space="preserve"> </w:t>
       </w:r>
       <m:oMath>
-        <m:r>
-          <m:t>h</m:t>
-        </m:r>
-        <m:r>
-          <m:rPr>
-            <m:sty m:val="p"/>
-          </m:rPr>
-          <m:t>=</m:t>
-        </m:r>
         <m:r>
           <m:t>0.96</m:t>
         </m:r>
@@ -16440,39 +16481,36 @@
         <w:t xml:space="preserve">Sentinel</w:t>
       </w:r>
       <w:r>
-        <w:t xml:space="preserve">,</w:t>
+        <w:t xml:space="preserve">, honesty</w:t>
       </w:r>
       <w:r>
         <w:t xml:space="preserve"> </w:t>
       </w:r>
       <m:oMath>
         <m:r>
-          <m:t>h</m:t>
-        </m:r>
-        <m:r>
-          <m:rPr>
-            <m:sty m:val="p"/>
-          </m:rPr>
-          <m:t>=</m:t>
-        </m:r>
-        <m:r>
           <m:t>0.92</m:t>
         </m:r>
       </m:oMath>
       <w:r>
-        <w:t xml:space="preserve">) with caution: their reasoning-augmented</w:t>
-      </w:r>
-      <w:r>
-        <w:t xml:space="preserve"> </w:t>
-      </w:r>
-      <w:r>
-        <w:t xml:space="preserve">river value-betting makes trust and aggression rise together without</w:t>
-      </w:r>
-      <w:r>
-        <w:t xml:space="preserve"> </w:t>
-      </w:r>
-      <w:r>
-        <w:t xml:space="preserve">any deception, so the</w:t>
+        <w:t xml:space="preserve">) warrants some skepticism: their</w:t>
+      </w:r>
+      <w:r>
+        <w:t xml:space="preserve"> </w:t>
+      </w:r>
+      <w:r>
+        <w:t xml:space="preserve">reasoning-enhanced river value-betting causes trust and aggression to</w:t>
+      </w:r>
+      <w:r>
+        <w:t xml:space="preserve"> </w:t>
+      </w:r>
+      <w:r>
+        <w:t xml:space="preserve">rise together without any deception, somewhat exaggerating their</w:t>
+      </w:r>
+      <w:r>
+        <w:t xml:space="preserve"> </w:t>
+      </w:r>
+      <w:r>
+        <w:t xml:space="preserve">apparent</w:t>
       </w:r>
       <w:r>
         <w:t xml:space="preserve"> </w:t>
@@ -16481,22 +16519,10 @@
         <w:t xml:space="preserve">“</w:t>
       </w:r>
       <w:r>
-        <w:t xml:space="preserve">farming</w:t>
+        <w:t xml:space="preserve">farming.</w:t>
       </w:r>
       <w:r>
         <w:t xml:space="preserve">”</w:t>
-      </w:r>
-      <w:r>
-        <w:t xml:space="preserve"> </w:t>
-      </w:r>
-      <w:r>
-        <w:t xml:space="preserve">label overstates the case for</w:t>
-      </w:r>
-      <w:r>
-        <w:t xml:space="preserve"> </w:t>
-      </w:r>
-      <w:r>
-        <w:t xml:space="preserve">them.</w:t>
       </w:r>
     </w:p>
     <w:p>
@@ -18934,7 +18960,7 @@
         <w:t xml:space="preserve"> </w:t>
       </w:r>
       <w:r>
-        <w:t xml:space="preserve">byte-identically;</w:t>
+        <w:t xml:space="preserve">are byte-identical;</w:t>
       </w:r>
       <w:r>
         <w:t xml:space="preserve"> </w:t>
@@ -18950,7 +18976,7 @@
         <w:t xml:space="preserve"> </w:t>
       </w:r>
       <w:r>
-        <w:t xml:space="preserve">differing only slightly before it blends at runtime),</w:t>
+        <w:t xml:space="preserve">is only minimally different and blends at runtime),</w:t>
       </w:r>
       <w:r>
         <w:t xml:space="preserve"> </w:t>
@@ -22700,19 +22726,19 @@
         <w:t xml:space="preserve"> </w:t>
       </w:r>
       <w:r>
-        <w:t xml:space="preserve">(Trust</w:t>
-      </w:r>
-      <w:r>
-        <w:t xml:space="preserve"> </w:t>
-      </w:r>
-      <w:r>
-        <w:t xml:space="preserve">Exploitation Index) is an agent’s mean non-showdown profit per</w:t>
-      </w:r>
-      <w:r>
-        <w:t xml:space="preserve"> </w:t>
-      </w:r>
-      <w:r>
-        <w:t xml:space="preserve">hand—value won through fold equity rather than at showdown.</w:t>
+        <w:t xml:space="preserve">(Trust Exploitation Index): an agent’s average</w:t>
+      </w:r>
+      <w:r>
+        <w:t xml:space="preserve"> </w:t>
+      </w:r>
+      <w:r>
+        <w:t xml:space="preserve">non-showdown winnings per hand—wins generated via fold equity</w:t>
+      </w:r>
+      <w:r>
+        <w:t xml:space="preserve"> </w:t>
+      </w:r>
+      <w:r>
+        <w:t xml:space="preserve">rather than at showdown.</w:t>
       </w:r>
     </w:p>
   </w:footnote>
@@ -22741,19 +22767,19 @@
         <w:t xml:space="preserve"> </w:t>
       </w:r>
       <w:r>
-        <w:t xml:space="preserve">(Context</w:t>
-      </w:r>
-      <w:r>
-        <w:t xml:space="preserve"> </w:t>
-      </w:r>
-      <w:r>
-        <w:t xml:space="preserve">Sensitivity) is the absolute correlation between an opponent’s recent</w:t>
-      </w:r>
-      <w:r>
-        <w:t xml:space="preserve"> </w:t>
-      </w:r>
-      <w:r>
-        <w:t xml:space="preserve">aggression and the agent’s own action.</w:t>
+        <w:t xml:space="preserve">(Contextual Sensitivity): the absolute correlation</w:t>
+      </w:r>
+      <w:r>
+        <w:t xml:space="preserve"> </w:t>
+      </w:r>
+      <w:r>
+        <w:t xml:space="preserve">between an opponent’s past aggression and the agent’s response</w:t>
+      </w:r>
+      <w:r>
+        <w:t xml:space="preserve"> </w:t>
+      </w:r>
+      <w:r>
+        <w:t xml:space="preserve">action.</w:t>
       </w:r>
     </w:p>
   </w:footnote>
@@ -22782,13 +22808,13 @@
         <w:t xml:space="preserve"> </w:t>
       </w:r>
       <w:r>
-        <w:t xml:space="preserve">(Opponent Adaptation) is the variance of</w:t>
-      </w:r>
-      <w:r>
-        <w:t xml:space="preserve"> </w:t>
-      </w:r>
-      <w:r>
-        <w:t xml:space="preserve">an agent’s aggression rate across different opponents.</w:t>
+        <w:t xml:space="preserve">(Opponent Adaptability): the variance of an agent’s</w:t>
+      </w:r>
+      <w:r>
+        <w:t xml:space="preserve"> </w:t>
+      </w:r>
+      <w:r>
+        <w:t xml:space="preserve">aggression rate across different opponents.</w:t>
       </w:r>
     </w:p>
   </w:footnote>
@@ -22817,19 +22843,19 @@
         <w:t xml:space="preserve"> </w:t>
       </w:r>
       <w:r>
-        <w:t xml:space="preserve">(Non-Stationarity)</w:t>
-      </w:r>
-      <w:r>
-        <w:t xml:space="preserve"> </w:t>
-      </w:r>
-      <w:r>
-        <w:t xml:space="preserve">gauges how much an agent’s action distribution drifts over the run,</w:t>
-      </w:r>
-      <w:r>
-        <w:t xml:space="preserve"> </w:t>
-      </w:r>
-      <w:r>
-        <w:t xml:space="preserve">comparing 500-hand windows against its overall distribution.</w:t>
+        <w:t xml:space="preserve">(Non-Stationarity): how much an agent’s action</w:t>
+      </w:r>
+      <w:r>
+        <w:t xml:space="preserve"> </w:t>
+      </w:r>
+      <w:r>
+        <w:t xml:space="preserve">distribution changes over the run, comparing 500-hand windows against</w:t>
+      </w:r>
+      <w:r>
+        <w:t xml:space="preserve"> </w:t>
+      </w:r>
+      <w:r>
+        <w:t xml:space="preserve">its overall distribution.</w:t>
       </w:r>
     </w:p>
   </w:footnote>

</xml_diff>

<commit_message>
paper: v14 — insert author's final two paraphrases; no highlighted text left
- Discussion opener and the 5.4 significance note replaced with the
  author's wording (un-highlighted). Nothing is crimson now.

Minor faithful-insertion adjustments (flagged to author): dropped the
nonsensical "for our organization" in the opener and turned the "In
order to establish ..." fragment into a complete sentence ("The
sections that follow establish ..."); dropped the garbled "(which are
assumed to be correlated with the number of seeds)" clause from the
significance note.

Build clean; no undefined refs; 12 pages.
</commit_message>
<xml_diff>
--- a/paper_resources/manuscript/main.docx
+++ b/paper_resources/manuscript/main.docx
@@ -18499,43 +18499,69 @@
         <w:pStyle w:val="FirstParagraph"/>
       </w:pPr>
       <w:r>
-        <w:t xml:space="preserve">The headline of this study is deliberately uncomfortable: across</w:t>
-      </w:r>
-      <w:r>
-        <w:t xml:space="preserve"> </w:t>
-      </w:r>
-      <w:r>
-        <w:t xml:space="preserve">every agent design we tested, being trusted was a financial</w:t>
-      </w:r>
-      <w:r>
-        <w:t xml:space="preserve"> </w:t>
-      </w:r>
-      <w:r>
-        <w:t xml:space="preserve">liability rather than an asset, and we could not optimise that</w:t>
-      </w:r>
-      <w:r>
-        <w:t xml:space="preserve"> </w:t>
-      </w:r>
-      <w:r>
-        <w:t xml:space="preserve">liability away—we could only reason it away. That distinction is</w:t>
-      </w:r>
-      <w:r>
-        <w:t xml:space="preserve"> </w:t>
-      </w:r>
-      <w:r>
-        <w:t xml:space="preserve">the paper’s central contribution. The sections below trace why the</w:t>
-      </w:r>
-      <w:r>
-        <w:t xml:space="preserve"> </w:t>
-      </w:r>
-      <w:r>
-        <w:t xml:space="preserve">trap forms, why numerical adaptation cannot escape it, and why</w:t>
-      </w:r>
-      <w:r>
-        <w:t xml:space="preserve"> </w:t>
-      </w:r>
-      <w:r>
-        <w:t xml:space="preserve">explicit reasoning can, while being candid about the limits of a</w:t>
+        <w:t xml:space="preserve">The title to this research has been intentionally unsettling; in</w:t>
+      </w:r>
+      <w:r>
+        <w:t xml:space="preserve"> </w:t>
+      </w:r>
+      <w:r>
+        <w:t xml:space="preserve">each agent configuration we tested, being</w:t>
+      </w:r>
+      <w:r>
+        <w:t xml:space="preserve"> </w:t>
+      </w:r>
+      <w:r>
+        <w:t xml:space="preserve">“</w:t>
+      </w:r>
+      <w:r>
+        <w:t xml:space="preserve">trusted</w:t>
+      </w:r>
+      <w:r>
+        <w:t xml:space="preserve">”</w:t>
+      </w:r>
+      <w:r>
+        <w:t xml:space="preserve"> </w:t>
+      </w:r>
+      <w:r>
+        <w:t xml:space="preserve">represented a</w:t>
+      </w:r>
+      <w:r>
+        <w:t xml:space="preserve"> </w:t>
+      </w:r>
+      <w:r>
+        <w:t xml:space="preserve">fiscal cost rather than a fiscal advantage, and there was no way to</w:t>
+      </w:r>
+      <w:r>
+        <w:t xml:space="preserve"> </w:t>
+      </w:r>
+      <w:r>
+        <w:t xml:space="preserve">remove or optimize that cost—all we could do was rationalize it.</w:t>
+      </w:r>
+    </w:p>
+    <w:p>
+      <w:pPr>
+        <w:pStyle w:val="BodyText"/>
+      </w:pPr>
+      <w:r>
+        <w:t xml:space="preserve">The sections that follow establish how the problem develops, why any</w:t>
+      </w:r>
+      <w:r>
+        <w:t xml:space="preserve"> </w:t>
+      </w:r>
+      <w:r>
+        <w:t xml:space="preserve">form of numerical optimization cannot resolve it, and how the use of</w:t>
+      </w:r>
+      <w:r>
+        <w:t xml:space="preserve"> </w:t>
+      </w:r>
+      <w:r>
+        <w:t xml:space="preserve">logical reasoning can keep the problem from occurring, but they also</w:t>
+      </w:r>
+      <w:r>
+        <w:t xml:space="preserve"> </w:t>
+      </w:r>
+      <w:r>
+        <w:t xml:space="preserve">provide insight into what limitations exist when doing so with a</w:t>
       </w:r>
       <w:r>
         <w:t xml:space="preserve"> </w:t>
@@ -20194,19 +20220,13 @@
         <w:t xml:space="preserve"> </w:t>
       </w:r>
       <w:r>
-        <w:t xml:space="preserve">random seeds.</w:t>
-      </w:r>
-      <w:r>
-        <w:t xml:space="preserve"> </w:t>
-      </w:r>
-      <w:r>
-        <w:t xml:space="preserve">The canonical test is a</w:t>
-      </w:r>
-      <w:r>
-        <w:t xml:space="preserve"> </w:t>
-      </w:r>
-      <w:r>
-        <w:t xml:space="preserve">one-sample</w:t>
+        <w:t xml:space="preserve">random seeds. The most common test is simply</w:t>
+      </w:r>
+      <w:r>
+        <w:t xml:space="preserve"> </w:t>
+      </w:r>
+      <w:r>
+        <w:t xml:space="preserve">a single-sample</w:t>
       </w:r>
       <w:r>
         <w:t xml:space="preserve"> </w:t>
@@ -20217,7 +20237,7 @@
         </m:r>
       </m:oMath>
       <w:r>
-        <w:t xml:space="preserve">-test of the five per-seed</w:t>
+        <w:t xml:space="preserve">-test comparing the average</w:t>
       </w:r>
       <w:r>
         <w:t xml:space="preserve"> </w:t>
@@ -20249,13 +20269,13 @@
         <w:t xml:space="preserve"> </w:t>
       </w:r>
       <w:r>
-        <w:t xml:space="preserve">values against zero</w:t>
-      </w:r>
-      <w:r>
-        <w:t xml:space="preserve"> </w:t>
-      </w:r>
-      <w:r>
-        <w:t xml:space="preserve">(df</w:t>
+        <w:t xml:space="preserve">value to zero</w:t>
+      </w:r>
+      <w:r>
+        <w:t xml:space="preserve"> </w:t>
+      </w:r>
+      <w:r>
+        <w:t xml:space="preserve">(with df</w:t>
       </w:r>
       <w:r>
         <w:t xml:space="preserve"> </w:t>
@@ -20272,7 +20292,7 @@
         </m:r>
       </m:oMath>
       <w:r>
-        <w:t xml:space="preserve">,</w:t>
+        <w:t xml:space="preserve">, and thus</w:t>
       </w:r>
       <w:r>
         <w:t xml:space="preserve"> </w:t>
@@ -20305,19 +20325,24 @@
         </m:r>
       </m:oMath>
       <w:r>
-        <w:t xml:space="preserve">); significance therefore depends</w:t>
-      </w:r>
-      <w:r>
-        <w:t xml:space="preserve"> </w:t>
-      </w:r>
-      <w:r>
-        <w:t xml:space="preserve">on the between-seed standard deviation rather than on any fixed</w:t>
-      </w:r>
-      <w:r>
-        <w:t xml:space="preserve"> </w:t>
-      </w:r>
-      <w:r>
-        <w:t xml:space="preserve">critical correlation, and we do not treat</w:t>
+        <w:t xml:space="preserve">); the test’s</w:t>
+      </w:r>
+      <w:r>
+        <w:t xml:space="preserve"> </w:t>
+      </w:r>
+      <m:oMath>
+        <m:r>
+          <m:t>p</m:t>
+        </m:r>
+      </m:oMath>
+      <w:r>
+        <w:t xml:space="preserve">-value therefore depends upon the between-seed variance, not some</w:t>
+      </w:r>
+      <w:r>
+        <w:t xml:space="preserve"> </w:t>
+      </w:r>
+      <w:r>
+        <w:t xml:space="preserve">fixed critical correlation value, and we do not view</w:t>
       </w:r>
       <w:r>
         <w:t xml:space="preserve"> </w:t>
@@ -20349,19 +20374,13 @@
         <w:t xml:space="preserve"> </w:t>
       </w:r>
       <w:r>
-        <w:t xml:space="preserve">as though it were</w:t>
-      </w:r>
-      <w:r>
-        <w:t xml:space="preserve"> </w:t>
-      </w:r>
-      <w:r>
-        <w:t xml:space="preserve">itself a five-point correlation.</w:t>
-      </w:r>
-      <w:r>
-        <w:t xml:space="preserve"> </w:t>
-      </w:r>
-      <w:r>
-        <w:t xml:space="preserve">The headline</w:t>
+        <w:t xml:space="preserve">as if it</w:t>
+      </w:r>
+      <w:r>
+        <w:t xml:space="preserve"> </w:t>
+      </w:r>
+      <w:r>
+        <w:t xml:space="preserve">were itself a five-point correlation. The headline</w:t>
       </w:r>
       <w:r>
         <w:t xml:space="preserve"> </w:t>

</xml_diff>